<commit_message>
Fix: Seccion 1 / Sección 2
-Se terminó la sección 2 "Google Tag Manager", se completaron los puntos 5, 6, 7, 8 y 9.

-Se agregaron screenshos de dichos puntos.

-Se corrigen detalles menores en la sección 1.
</commit_message>
<xml_diff>
--- a/docs/test.docx
+++ b/docs/test.docx
@@ -8603,25 +8603,3195 @@
     </w:p>
     <w:p>
       <w:pPr>
+        <w:pStyle w:val="Ttulo3"/>
+        <w:rPr>
+          <w:sz w:val="36"/>
+          <w:szCs w:val="36"/>
+        </w:rPr>
+      </w:pPr>
+      <w:r>
+        <w:rPr>
+          <w:sz w:val="36"/>
+          <w:szCs w:val="36"/>
+        </w:rPr>
+        <w:t>Sección 2 — Google Tag Manager</w:t>
+      </w:r>
+    </w:p>
+    <w:p>
+      <w:pPr>
+        <w:pStyle w:val="Ttulo3"/>
+      </w:pPr>
+      <w:r>
+        <w:t>Punto 5 — Variables, activadores y etiqueta GA4 para clic en imagen</w:t>
+      </w:r>
+    </w:p>
+    <w:p>
+      <w:pPr>
         <w:spacing w:before="100" w:beforeAutospacing="1" w:after="100" w:afterAutospacing="1" w:line="240" w:lineRule="auto"/>
-        <w:ind w:left="720"/>
-        <w:rPr>
-          <w:rFonts w:ascii="Times New Roman" w:eastAsia="Times New Roman" w:hAnsi="Times New Roman" w:cs="Times New Roman"/>
-          <w:sz w:val="24"/>
-          <w:szCs w:val="24"/>
-          <w:lang w:eastAsia="es-VE"/>
-        </w:rPr>
-      </w:pPr>
+        <w:rPr>
+          <w:rFonts w:ascii="Times New Roman" w:eastAsia="Times New Roman" w:hAnsi="Times New Roman" w:cs="Times New Roman"/>
+          <w:sz w:val="24"/>
+          <w:szCs w:val="24"/>
+          <w:lang w:eastAsia="es-VE"/>
+        </w:rPr>
+      </w:pPr>
+      <w:r>
+        <w:rPr>
+          <w:rFonts w:ascii="Times New Roman" w:eastAsia="Times New Roman" w:hAnsi="Times New Roman" w:cs="Times New Roman"/>
+          <w:b/>
+          <w:bCs/>
+          <w:sz w:val="24"/>
+          <w:szCs w:val="24"/>
+          <w:lang w:eastAsia="es-VE"/>
+        </w:rPr>
+        <w:t>Descripción</w:t>
+      </w:r>
+      <w:r>
+        <w:rPr>
+          <w:rFonts w:ascii="Times New Roman" w:eastAsia="Times New Roman" w:hAnsi="Times New Roman" w:cs="Times New Roman"/>
+          <w:b/>
+          <w:bCs/>
+          <w:sz w:val="24"/>
+          <w:szCs w:val="24"/>
+          <w:lang w:eastAsia="es-VE"/>
+        </w:rPr>
+        <w:t>:</w:t>
+      </w:r>
+      <w:r>
+        <w:rPr>
+          <w:rFonts w:ascii="Times New Roman" w:eastAsia="Times New Roman" w:hAnsi="Times New Roman" w:cs="Times New Roman"/>
+          <w:sz w:val="24"/>
+          <w:szCs w:val="24"/>
+          <w:lang w:eastAsia="es-VE"/>
+        </w:rPr>
+        <w:t xml:space="preserve"> Se configuraron en GTM dos variables para capturar el </w:t>
+      </w:r>
+      <w:r>
+        <w:rPr>
+          <w:rFonts w:ascii="Courier New" w:eastAsia="Times New Roman" w:hAnsi="Courier New" w:cs="Courier New"/>
+          <w:sz w:val="20"/>
+          <w:szCs w:val="20"/>
+          <w:lang w:eastAsia="es-VE"/>
+        </w:rPr>
+        <w:t>title</w:t>
+      </w:r>
+      <w:r>
+        <w:rPr>
+          <w:rFonts w:ascii="Times New Roman" w:eastAsia="Times New Roman" w:hAnsi="Times New Roman" w:cs="Times New Roman"/>
+          <w:sz w:val="24"/>
+          <w:szCs w:val="24"/>
+          <w:lang w:eastAsia="es-VE"/>
+        </w:rPr>
+        <w:t xml:space="preserve"> y el </w:t>
+      </w:r>
+      <w:r>
+        <w:rPr>
+          <w:rFonts w:ascii="Courier New" w:eastAsia="Times New Roman" w:hAnsi="Courier New" w:cs="Courier New"/>
+          <w:sz w:val="20"/>
+          <w:szCs w:val="20"/>
+          <w:lang w:eastAsia="es-VE"/>
+        </w:rPr>
+        <w:t>src</w:t>
+      </w:r>
+      <w:r>
+        <w:rPr>
+          <w:rFonts w:ascii="Times New Roman" w:eastAsia="Times New Roman" w:hAnsi="Times New Roman" w:cs="Times New Roman"/>
+          <w:sz w:val="24"/>
+          <w:szCs w:val="24"/>
+          <w:lang w:eastAsia="es-VE"/>
+        </w:rPr>
+        <w:t xml:space="preserve"> de la imagen al momento del clic, un activador que detecta clics sobre imágenes y una etiqueta de evento GA4.</w:t>
+      </w:r>
+    </w:p>
+    <w:p>
+      <w:pPr>
+        <w:spacing w:before="100" w:beforeAutospacing="1" w:after="100" w:afterAutospacing="1" w:line="240" w:lineRule="auto"/>
+        <w:rPr>
+          <w:rFonts w:ascii="Times New Roman" w:eastAsia="Times New Roman" w:hAnsi="Times New Roman" w:cs="Times New Roman"/>
+          <w:sz w:val="24"/>
+          <w:szCs w:val="24"/>
+          <w:lang w:eastAsia="es-VE"/>
+        </w:rPr>
+      </w:pPr>
+      <w:r>
+        <w:rPr>
+          <w:rFonts w:ascii="Times New Roman" w:eastAsia="Times New Roman" w:hAnsi="Times New Roman" w:cs="Times New Roman"/>
+          <w:b/>
+          <w:bCs/>
+          <w:sz w:val="24"/>
+          <w:szCs w:val="24"/>
+          <w:lang w:eastAsia="es-VE"/>
+        </w:rPr>
+        <w:t>Variables incorporadas habilitadas</w:t>
+      </w:r>
+    </w:p>
+    <w:p>
+      <w:pPr>
+        <w:numPr>
+          <w:ilvl w:val="0"/>
+          <w:numId w:val="8"/>
+        </w:numPr>
+        <w:spacing w:before="100" w:beforeAutospacing="1" w:after="100" w:afterAutospacing="1" w:line="240" w:lineRule="auto"/>
+        <w:rPr>
+          <w:rFonts w:ascii="Times New Roman" w:eastAsia="Times New Roman" w:hAnsi="Times New Roman" w:cs="Times New Roman"/>
+          <w:sz w:val="24"/>
+          <w:szCs w:val="24"/>
+          <w:lang w:eastAsia="es-VE"/>
+        </w:rPr>
+      </w:pPr>
+      <w:r>
+        <w:rPr>
+          <w:rFonts w:ascii="Courier New" w:eastAsia="Times New Roman" w:hAnsi="Courier New" w:cs="Courier New"/>
+          <w:sz w:val="20"/>
+          <w:szCs w:val="20"/>
+          <w:lang w:eastAsia="es-VE"/>
+        </w:rPr>
+        <w:t>Click Element</w:t>
+      </w:r>
+    </w:p>
+    <w:p>
+      <w:pPr>
+        <w:numPr>
+          <w:ilvl w:val="0"/>
+          <w:numId w:val="8"/>
+        </w:numPr>
+        <w:spacing w:before="100" w:beforeAutospacing="1" w:after="100" w:afterAutospacing="1" w:line="240" w:lineRule="auto"/>
+        <w:rPr>
+          <w:rFonts w:ascii="Times New Roman" w:eastAsia="Times New Roman" w:hAnsi="Times New Roman" w:cs="Times New Roman"/>
+          <w:sz w:val="24"/>
+          <w:szCs w:val="24"/>
+          <w:lang w:eastAsia="es-VE"/>
+        </w:rPr>
+      </w:pPr>
+      <w:r>
+        <w:rPr>
+          <w:rFonts w:ascii="Courier New" w:eastAsia="Times New Roman" w:hAnsi="Courier New" w:cs="Courier New"/>
+          <w:sz w:val="20"/>
+          <w:szCs w:val="20"/>
+          <w:lang w:eastAsia="es-VE"/>
+        </w:rPr>
+        <w:t>Click Classes</w:t>
+      </w:r>
+    </w:p>
+    <w:p>
+      <w:pPr>
+        <w:numPr>
+          <w:ilvl w:val="0"/>
+          <w:numId w:val="8"/>
+        </w:numPr>
+        <w:spacing w:before="100" w:beforeAutospacing="1" w:after="100" w:afterAutospacing="1" w:line="240" w:lineRule="auto"/>
+        <w:rPr>
+          <w:rFonts w:ascii="Times New Roman" w:eastAsia="Times New Roman" w:hAnsi="Times New Roman" w:cs="Times New Roman"/>
+          <w:sz w:val="24"/>
+          <w:szCs w:val="24"/>
+          <w:lang w:eastAsia="es-VE"/>
+        </w:rPr>
+      </w:pPr>
+      <w:r>
+        <w:rPr>
+          <w:rFonts w:ascii="Courier New" w:eastAsia="Times New Roman" w:hAnsi="Courier New" w:cs="Courier New"/>
+          <w:sz w:val="20"/>
+          <w:szCs w:val="20"/>
+          <w:lang w:eastAsia="es-VE"/>
+        </w:rPr>
+        <w:t>Click ID</w:t>
+      </w:r>
+    </w:p>
+    <w:p>
+      <w:pPr>
+        <w:numPr>
+          <w:ilvl w:val="0"/>
+          <w:numId w:val="8"/>
+        </w:numPr>
+        <w:spacing w:before="100" w:beforeAutospacing="1" w:after="100" w:afterAutospacing="1" w:line="240" w:lineRule="auto"/>
+        <w:rPr>
+          <w:rFonts w:ascii="Times New Roman" w:eastAsia="Times New Roman" w:hAnsi="Times New Roman" w:cs="Times New Roman"/>
+          <w:sz w:val="24"/>
+          <w:szCs w:val="24"/>
+          <w:lang w:eastAsia="es-VE"/>
+        </w:rPr>
+      </w:pPr>
+      <w:r>
+        <w:rPr>
+          <w:rFonts w:ascii="Courier New" w:eastAsia="Times New Roman" w:hAnsi="Courier New" w:cs="Courier New"/>
+          <w:sz w:val="20"/>
+          <w:szCs w:val="20"/>
+          <w:lang w:eastAsia="es-VE"/>
+        </w:rPr>
+        <w:t>Click URL</w:t>
+      </w:r>
+    </w:p>
+    <w:p>
+      <w:pPr>
+        <w:numPr>
+          <w:ilvl w:val="0"/>
+          <w:numId w:val="8"/>
+        </w:numPr>
+        <w:spacing w:before="100" w:beforeAutospacing="1" w:after="100" w:afterAutospacing="1" w:line="240" w:lineRule="auto"/>
+        <w:rPr>
+          <w:rFonts w:ascii="Times New Roman" w:eastAsia="Times New Roman" w:hAnsi="Times New Roman" w:cs="Times New Roman"/>
+          <w:sz w:val="24"/>
+          <w:szCs w:val="24"/>
+          <w:lang w:eastAsia="es-VE"/>
+        </w:rPr>
+      </w:pPr>
+      <w:r>
+        <w:rPr>
+          <w:rFonts w:ascii="Courier New" w:eastAsia="Times New Roman" w:hAnsi="Courier New" w:cs="Courier New"/>
+          <w:sz w:val="20"/>
+          <w:szCs w:val="20"/>
+          <w:lang w:eastAsia="es-VE"/>
+        </w:rPr>
+        <w:t>Click Target</w:t>
+      </w:r>
+    </w:p>
+    <w:p>
+      <w:pPr>
+        <w:spacing w:before="100" w:beforeAutospacing="1" w:after="100" w:afterAutospacing="1" w:line="240" w:lineRule="auto"/>
+        <w:rPr>
+          <w:rFonts w:ascii="Times New Roman" w:eastAsia="Times New Roman" w:hAnsi="Times New Roman" w:cs="Times New Roman"/>
+          <w:sz w:val="24"/>
+          <w:szCs w:val="24"/>
+          <w:lang w:eastAsia="es-VE"/>
+        </w:rPr>
+      </w:pPr>
+      <w:r>
+        <w:rPr>
+          <w:rFonts w:ascii="Times New Roman" w:eastAsia="Times New Roman" w:hAnsi="Times New Roman" w:cs="Times New Roman"/>
+          <w:b/>
+          <w:bCs/>
+          <w:sz w:val="24"/>
+          <w:szCs w:val="24"/>
+          <w:lang w:eastAsia="es-VE"/>
+        </w:rPr>
+        <w:t xml:space="preserve">Variable 1 — </w:t>
+      </w:r>
+      <w:r>
+        <w:rPr>
+          <w:rFonts w:ascii="Courier New" w:eastAsia="Times New Roman" w:hAnsi="Courier New" w:cs="Courier New"/>
+          <w:b/>
+          <w:bCs/>
+          <w:sz w:val="20"/>
+          <w:szCs w:val="20"/>
+          <w:lang w:eastAsia="es-VE"/>
+        </w:rPr>
+        <w:t>var_titulo_imagen</w:t>
+      </w:r>
+    </w:p>
+    <w:p>
+      <w:pPr>
+        <w:numPr>
+          <w:ilvl w:val="0"/>
+          <w:numId w:val="9"/>
+        </w:numPr>
+        <w:spacing w:before="100" w:beforeAutospacing="1" w:after="100" w:afterAutospacing="1" w:line="240" w:lineRule="auto"/>
+        <w:rPr>
+          <w:rFonts w:ascii="Times New Roman" w:eastAsia="Times New Roman" w:hAnsi="Times New Roman" w:cs="Times New Roman"/>
+          <w:sz w:val="24"/>
+          <w:szCs w:val="24"/>
+          <w:lang w:eastAsia="es-VE"/>
+        </w:rPr>
+      </w:pPr>
+      <w:r>
+        <w:rPr>
+          <w:rFonts w:ascii="Times New Roman" w:eastAsia="Times New Roman" w:hAnsi="Times New Roman" w:cs="Times New Roman"/>
+          <w:sz w:val="24"/>
+          <w:szCs w:val="24"/>
+          <w:lang w:eastAsia="es-VE"/>
+        </w:rPr>
+        <w:t>Tipo: Variable de JavaScript personalizado</w:t>
+      </w:r>
+    </w:p>
+    <w:p>
+      <w:pPr>
+        <w:spacing w:after="0" w:line="240" w:lineRule="auto"/>
+        <w:rPr>
+          <w:rFonts w:ascii="Times New Roman" w:eastAsia="Times New Roman" w:hAnsi="Times New Roman" w:cs="Times New Roman"/>
+          <w:sz w:val="24"/>
+          <w:szCs w:val="24"/>
+          <w:lang w:eastAsia="es-VE"/>
+        </w:rPr>
+      </w:pPr>
+      <w:r>
+        <w:rPr>
+          <w:rFonts w:ascii="Times New Roman" w:eastAsia="Times New Roman" w:hAnsi="Times New Roman" w:cs="Times New Roman"/>
+          <w:sz w:val="24"/>
+          <w:szCs w:val="24"/>
+          <w:lang w:eastAsia="es-VE"/>
+        </w:rPr>
+        <w:t>javascript</w:t>
+      </w:r>
+    </w:p>
+    <w:p>
+      <w:pPr>
+        <w:pStyle w:val="CONSOLA"/>
+        <w:rPr>
+          <w:color w:val="EAECF0"/>
+        </w:rPr>
+      </w:pPr>
+      <w:r>
+        <w:t>function</w:t>
+      </w:r>
+      <w:r>
+        <w:rPr>
+          <w:color w:val="D3D7DE"/>
+        </w:rPr>
+        <w:t>()</w:t>
+      </w:r>
+      <w:r>
+        <w:rPr>
+          <w:color w:val="EAECF0"/>
+        </w:rPr>
+        <w:t xml:space="preserve"> </w:t>
+      </w:r>
+      <w:r>
+        <w:rPr>
+          <w:color w:val="D3D7DE"/>
+        </w:rPr>
+        <w:t>{</w:t>
+      </w:r>
+    </w:p>
+    <w:p>
+      <w:pPr>
+        <w:pStyle w:val="CONSOLA"/>
+        <w:rPr>
+          <w:color w:val="EAECF0"/>
+        </w:rPr>
+      </w:pPr>
+      <w:r>
+        <w:rPr>
+          <w:color w:val="EAECF0"/>
+        </w:rPr>
+        <w:t xml:space="preserve">  </w:t>
+      </w:r>
+      <w:r>
+        <w:t>var</w:t>
+      </w:r>
+      <w:r>
+        <w:rPr>
+          <w:color w:val="EAECF0"/>
+        </w:rPr>
+        <w:t xml:space="preserve"> el = </w:t>
+      </w:r>
+      <w:r>
+        <w:rPr>
+          <w:color w:val="D3D7DE"/>
+        </w:rPr>
+        <w:t>{{</w:t>
+      </w:r>
+      <w:r>
+        <w:rPr>
+          <w:color w:val="FBAD60"/>
+        </w:rPr>
+        <w:t>Click</w:t>
+      </w:r>
+      <w:r>
+        <w:rPr>
+          <w:color w:val="EAECF0"/>
+        </w:rPr>
+        <w:t xml:space="preserve"> </w:t>
+      </w:r>
+      <w:r>
+        <w:rPr>
+          <w:color w:val="FBAD60"/>
+        </w:rPr>
+        <w:t>Element</w:t>
+      </w:r>
+      <w:r>
+        <w:rPr>
+          <w:color w:val="D3D7DE"/>
+        </w:rPr>
+        <w:t>}};</w:t>
+      </w:r>
+    </w:p>
+    <w:p>
+      <w:pPr>
+        <w:pStyle w:val="CONSOLA"/>
+        <w:rPr>
+          <w:color w:val="EAECF0"/>
+        </w:rPr>
+      </w:pPr>
+      <w:r>
+        <w:rPr>
+          <w:color w:val="EAECF0"/>
+        </w:rPr>
+        <w:t xml:space="preserve">  </w:t>
+      </w:r>
+      <w:r>
+        <w:t>if</w:t>
+      </w:r>
+      <w:r>
+        <w:rPr>
+          <w:color w:val="EAECF0"/>
+        </w:rPr>
+        <w:t xml:space="preserve"> </w:t>
+      </w:r>
+      <w:r>
+        <w:rPr>
+          <w:color w:val="D3D7DE"/>
+        </w:rPr>
+        <w:t>(</w:t>
+      </w:r>
+      <w:r>
+        <w:rPr>
+          <w:color w:val="EAECF0"/>
+        </w:rPr>
+        <w:t>el &amp;&amp; el</w:t>
+      </w:r>
+      <w:r>
+        <w:rPr>
+          <w:color w:val="D3D7DE"/>
+        </w:rPr>
+        <w:t>.</w:t>
+      </w:r>
+      <w:r>
+        <w:rPr>
+          <w:color w:val="EAECF0"/>
+        </w:rPr>
+        <w:t xml:space="preserve">tagName === </w:t>
+      </w:r>
+      <w:r>
+        <w:rPr>
+          <w:color w:val="9BE963"/>
+        </w:rPr>
+        <w:t>'IMG'</w:t>
+      </w:r>
+      <w:r>
+        <w:rPr>
+          <w:color w:val="D3D7DE"/>
+        </w:rPr>
+        <w:t>)</w:t>
+      </w:r>
+      <w:r>
+        <w:rPr>
+          <w:color w:val="EAECF0"/>
+        </w:rPr>
+        <w:t xml:space="preserve"> </w:t>
+      </w:r>
+      <w:r>
+        <w:t>return</w:t>
+      </w:r>
+      <w:r>
+        <w:rPr>
+          <w:color w:val="EAECF0"/>
+        </w:rPr>
+        <w:t xml:space="preserve"> el</w:t>
+      </w:r>
+      <w:r>
+        <w:rPr>
+          <w:color w:val="D3D7DE"/>
+        </w:rPr>
+        <w:t>.</w:t>
+      </w:r>
+      <w:r>
+        <w:rPr>
+          <w:color w:val="70B8FF"/>
+        </w:rPr>
+        <w:t>getAttribute</w:t>
+      </w:r>
+      <w:r>
+        <w:rPr>
+          <w:color w:val="D3D7DE"/>
+        </w:rPr>
+        <w:t>(</w:t>
+      </w:r>
+      <w:r>
+        <w:rPr>
+          <w:color w:val="9BE963"/>
+        </w:rPr>
+        <w:t>'title'</w:t>
+      </w:r>
+      <w:r>
+        <w:rPr>
+          <w:color w:val="D3D7DE"/>
+        </w:rPr>
+        <w:t>);</w:t>
+      </w:r>
+    </w:p>
+    <w:p>
+      <w:pPr>
+        <w:pStyle w:val="CONSOLA"/>
+        <w:rPr>
+          <w:color w:val="EAECF0"/>
+        </w:rPr>
+      </w:pPr>
+      <w:r>
+        <w:rPr>
+          <w:color w:val="EAECF0"/>
+        </w:rPr>
+        <w:t xml:space="preserve">  </w:t>
+      </w:r>
+      <w:r>
+        <w:t>if</w:t>
+      </w:r>
+      <w:r>
+        <w:rPr>
+          <w:color w:val="EAECF0"/>
+        </w:rPr>
+        <w:t xml:space="preserve"> </w:t>
+      </w:r>
+      <w:r>
+        <w:rPr>
+          <w:color w:val="D3D7DE"/>
+        </w:rPr>
+        <w:t>(</w:t>
+      </w:r>
+      <w:r>
+        <w:rPr>
+          <w:color w:val="EAECF0"/>
+        </w:rPr>
+        <w:t>el</w:t>
+      </w:r>
+      <w:r>
+        <w:rPr>
+          <w:color w:val="D3D7DE"/>
+        </w:rPr>
+        <w:t>)</w:t>
+      </w:r>
+      <w:r>
+        <w:rPr>
+          <w:color w:val="EAECF0"/>
+        </w:rPr>
+        <w:t xml:space="preserve"> </w:t>
+      </w:r>
+      <w:r>
+        <w:rPr>
+          <w:color w:val="D3D7DE"/>
+        </w:rPr>
+        <w:t>{</w:t>
+      </w:r>
+    </w:p>
+    <w:p>
+      <w:pPr>
+        <w:pStyle w:val="CONSOLA"/>
+        <w:rPr>
+          <w:color w:val="EAECF0"/>
+        </w:rPr>
+      </w:pPr>
+      <w:r>
+        <w:rPr>
+          <w:color w:val="EAECF0"/>
+        </w:rPr>
+        <w:t xml:space="preserve">    </w:t>
+      </w:r>
+      <w:r>
+        <w:t>var</w:t>
+      </w:r>
+      <w:r>
+        <w:rPr>
+          <w:color w:val="EAECF0"/>
+        </w:rPr>
+        <w:t xml:space="preserve"> img = el</w:t>
+      </w:r>
+      <w:r>
+        <w:rPr>
+          <w:color w:val="D3D7DE"/>
+        </w:rPr>
+        <w:t>.</w:t>
+      </w:r>
+      <w:r>
+        <w:rPr>
+          <w:color w:val="70B8FF"/>
+        </w:rPr>
+        <w:t>querySelector</w:t>
+      </w:r>
+      <w:r>
+        <w:rPr>
+          <w:color w:val="D3D7DE"/>
+        </w:rPr>
+        <w:t>(</w:t>
+      </w:r>
+      <w:r>
+        <w:rPr>
+          <w:color w:val="9BE963"/>
+        </w:rPr>
+        <w:t>'img'</w:t>
+      </w:r>
+      <w:r>
+        <w:rPr>
+          <w:color w:val="D3D7DE"/>
+        </w:rPr>
+        <w:t>);</w:t>
+      </w:r>
+    </w:p>
+    <w:p>
+      <w:pPr>
+        <w:pStyle w:val="CONSOLA"/>
+        <w:rPr>
+          <w:color w:val="EAECF0"/>
+        </w:rPr>
+      </w:pPr>
+      <w:r>
+        <w:rPr>
+          <w:color w:val="EAECF0"/>
+        </w:rPr>
+        <w:t xml:space="preserve">    </w:t>
+      </w:r>
+      <w:r>
+        <w:t>if</w:t>
+      </w:r>
+      <w:r>
+        <w:rPr>
+          <w:color w:val="EAECF0"/>
+        </w:rPr>
+        <w:t xml:space="preserve"> </w:t>
+      </w:r>
+      <w:r>
+        <w:rPr>
+          <w:color w:val="D3D7DE"/>
+        </w:rPr>
+        <w:t>(</w:t>
+      </w:r>
+      <w:r>
+        <w:rPr>
+          <w:color w:val="EAECF0"/>
+        </w:rPr>
+        <w:t>img</w:t>
+      </w:r>
+      <w:r>
+        <w:rPr>
+          <w:color w:val="D3D7DE"/>
+        </w:rPr>
+        <w:t>)</w:t>
+      </w:r>
+      <w:r>
+        <w:rPr>
+          <w:color w:val="EAECF0"/>
+        </w:rPr>
+        <w:t xml:space="preserve"> </w:t>
+      </w:r>
+      <w:r>
+        <w:t>return</w:t>
+      </w:r>
+      <w:r>
+        <w:rPr>
+          <w:color w:val="EAECF0"/>
+        </w:rPr>
+        <w:t xml:space="preserve"> img</w:t>
+      </w:r>
+      <w:r>
+        <w:rPr>
+          <w:color w:val="D3D7DE"/>
+        </w:rPr>
+        <w:t>.</w:t>
+      </w:r>
+      <w:r>
+        <w:rPr>
+          <w:color w:val="70B8FF"/>
+        </w:rPr>
+        <w:t>getAttribute</w:t>
+      </w:r>
+      <w:r>
+        <w:rPr>
+          <w:color w:val="D3D7DE"/>
+        </w:rPr>
+        <w:t>(</w:t>
+      </w:r>
+      <w:r>
+        <w:rPr>
+          <w:color w:val="9BE963"/>
+        </w:rPr>
+        <w:t>'title'</w:t>
+      </w:r>
+      <w:r>
+        <w:rPr>
+          <w:color w:val="D3D7DE"/>
+        </w:rPr>
+        <w:t>);</w:t>
+      </w:r>
+    </w:p>
+    <w:p>
+      <w:pPr>
+        <w:pStyle w:val="CONSOLA"/>
+        <w:rPr>
+          <w:color w:val="EAECF0"/>
+        </w:rPr>
+      </w:pPr>
+      <w:r>
+        <w:rPr>
+          <w:color w:val="EAECF0"/>
+        </w:rPr>
+        <w:t xml:space="preserve">  </w:t>
+      </w:r>
+      <w:r>
+        <w:rPr>
+          <w:color w:val="D3D7DE"/>
+        </w:rPr>
+        <w:t>}</w:t>
+      </w:r>
+    </w:p>
+    <w:p>
+      <w:pPr>
+        <w:pStyle w:val="CONSOLA"/>
+        <w:rPr>
+          <w:color w:val="EAECF0"/>
+        </w:rPr>
+      </w:pPr>
+      <w:r>
+        <w:rPr>
+          <w:color w:val="EAECF0"/>
+        </w:rPr>
+        <w:lastRenderedPageBreak/>
+        <w:t xml:space="preserve">  </w:t>
+      </w:r>
+      <w:r>
+        <w:t>return</w:t>
+      </w:r>
+      <w:r>
+        <w:rPr>
+          <w:color w:val="EAECF0"/>
+        </w:rPr>
+        <w:t xml:space="preserve"> </w:t>
+      </w:r>
+      <w:r>
+        <w:t>undefined</w:t>
+      </w:r>
+      <w:r>
+        <w:rPr>
+          <w:color w:val="D3D7DE"/>
+        </w:rPr>
+        <w:t>;</w:t>
+      </w:r>
+    </w:p>
+    <w:p>
+      <w:pPr>
+        <w:pStyle w:val="CONSOLA"/>
+        <w:rPr>
+          <w:color w:val="EAECF0"/>
+        </w:rPr>
+      </w:pPr>
+      <w:r>
+        <w:rPr>
+          <w:color w:val="D3D7DE"/>
+        </w:rPr>
+        <w:t>}</w:t>
+      </w:r>
+    </w:p>
+    <w:p>
+      <w:pPr>
+        <w:spacing w:before="100" w:beforeAutospacing="1" w:after="100" w:afterAutospacing="1" w:line="240" w:lineRule="auto"/>
+        <w:rPr>
+          <w:rFonts w:ascii="Times New Roman" w:eastAsia="Times New Roman" w:hAnsi="Times New Roman" w:cs="Times New Roman"/>
+          <w:sz w:val="24"/>
+          <w:szCs w:val="24"/>
+          <w:lang w:eastAsia="es-VE"/>
+        </w:rPr>
+      </w:pPr>
+      <w:r>
+        <w:rPr>
+          <w:rFonts w:ascii="Times New Roman" w:eastAsia="Times New Roman" w:hAnsi="Times New Roman" w:cs="Times New Roman"/>
+          <w:b/>
+          <w:bCs/>
+          <w:sz w:val="24"/>
+          <w:szCs w:val="24"/>
+          <w:lang w:eastAsia="es-VE"/>
+        </w:rPr>
+        <w:t xml:space="preserve">Variable 2 — </w:t>
+      </w:r>
+      <w:r>
+        <w:rPr>
+          <w:rFonts w:ascii="Courier New" w:eastAsia="Times New Roman" w:hAnsi="Courier New" w:cs="Courier New"/>
+          <w:b/>
+          <w:bCs/>
+          <w:sz w:val="20"/>
+          <w:szCs w:val="20"/>
+          <w:lang w:eastAsia="es-VE"/>
+        </w:rPr>
+        <w:t>var_src_imagen</w:t>
+      </w:r>
+    </w:p>
+    <w:p>
+      <w:pPr>
+        <w:numPr>
+          <w:ilvl w:val="0"/>
+          <w:numId w:val="10"/>
+        </w:numPr>
+        <w:spacing w:before="100" w:beforeAutospacing="1" w:after="100" w:afterAutospacing="1" w:line="240" w:lineRule="auto"/>
+        <w:rPr>
+          <w:rFonts w:ascii="Times New Roman" w:eastAsia="Times New Roman" w:hAnsi="Times New Roman" w:cs="Times New Roman"/>
+          <w:sz w:val="24"/>
+          <w:szCs w:val="24"/>
+          <w:lang w:eastAsia="es-VE"/>
+        </w:rPr>
+      </w:pPr>
+      <w:r>
+        <w:rPr>
+          <w:rFonts w:ascii="Times New Roman" w:eastAsia="Times New Roman" w:hAnsi="Times New Roman" w:cs="Times New Roman"/>
+          <w:sz w:val="24"/>
+          <w:szCs w:val="24"/>
+          <w:lang w:eastAsia="es-VE"/>
+        </w:rPr>
+        <w:t>Tipo: Variable de JavaScript personalizado</w:t>
+      </w:r>
+    </w:p>
+    <w:p>
+      <w:pPr>
+        <w:spacing w:after="0" w:line="240" w:lineRule="auto"/>
+        <w:rPr>
+          <w:rFonts w:ascii="Times New Roman" w:eastAsia="Times New Roman" w:hAnsi="Times New Roman" w:cs="Times New Roman"/>
+          <w:sz w:val="24"/>
+          <w:szCs w:val="24"/>
+          <w:lang w:eastAsia="es-VE"/>
+        </w:rPr>
+      </w:pPr>
+      <w:r>
+        <w:rPr>
+          <w:rFonts w:ascii="Times New Roman" w:eastAsia="Times New Roman" w:hAnsi="Times New Roman" w:cs="Times New Roman"/>
+          <w:sz w:val="24"/>
+          <w:szCs w:val="24"/>
+          <w:lang w:eastAsia="es-VE"/>
+        </w:rPr>
+        <w:t>javascript</w:t>
+      </w:r>
+    </w:p>
+    <w:p>
+      <w:pPr>
+        <w:pStyle w:val="CONSOLA"/>
+        <w:rPr>
+          <w:color w:val="EAECF0"/>
+        </w:rPr>
+      </w:pPr>
+      <w:r>
+        <w:t>function</w:t>
+      </w:r>
+      <w:r>
+        <w:rPr>
+          <w:color w:val="D3D7DE"/>
+        </w:rPr>
+        <w:t>()</w:t>
+      </w:r>
+      <w:r>
+        <w:rPr>
+          <w:color w:val="EAECF0"/>
+        </w:rPr>
+        <w:t xml:space="preserve"> </w:t>
+      </w:r>
+      <w:r>
+        <w:rPr>
+          <w:color w:val="D3D7DE"/>
+        </w:rPr>
+        <w:t>{</w:t>
+      </w:r>
+    </w:p>
+    <w:p>
+      <w:pPr>
+        <w:pStyle w:val="CONSOLA"/>
+        <w:rPr>
+          <w:color w:val="EAECF0"/>
+        </w:rPr>
+      </w:pPr>
+      <w:r>
+        <w:rPr>
+          <w:color w:val="EAECF0"/>
+        </w:rPr>
+        <w:t xml:space="preserve">  </w:t>
+      </w:r>
+      <w:r>
+        <w:t>var</w:t>
+      </w:r>
+      <w:r>
+        <w:rPr>
+          <w:color w:val="EAECF0"/>
+        </w:rPr>
+        <w:t xml:space="preserve"> el = </w:t>
+      </w:r>
+      <w:r>
+        <w:rPr>
+          <w:color w:val="D3D7DE"/>
+        </w:rPr>
+        <w:t>{{</w:t>
+      </w:r>
+      <w:r>
+        <w:rPr>
+          <w:color w:val="FBAD60"/>
+        </w:rPr>
+        <w:t>Click</w:t>
+      </w:r>
+      <w:r>
+        <w:rPr>
+          <w:color w:val="EAECF0"/>
+        </w:rPr>
+        <w:t xml:space="preserve"> </w:t>
+      </w:r>
+      <w:r>
+        <w:rPr>
+          <w:color w:val="FBAD60"/>
+        </w:rPr>
+        <w:t>Element</w:t>
+      </w:r>
+      <w:r>
+        <w:rPr>
+          <w:color w:val="D3D7DE"/>
+        </w:rPr>
+        <w:t>}};</w:t>
+      </w:r>
+    </w:p>
+    <w:p>
+      <w:pPr>
+        <w:pStyle w:val="CONSOLA"/>
+        <w:rPr>
+          <w:color w:val="EAECF0"/>
+        </w:rPr>
+      </w:pPr>
+      <w:r>
+        <w:rPr>
+          <w:color w:val="EAECF0"/>
+        </w:rPr>
+        <w:t xml:space="preserve">  </w:t>
+      </w:r>
+      <w:r>
+        <w:t>if</w:t>
+      </w:r>
+      <w:r>
+        <w:rPr>
+          <w:color w:val="EAECF0"/>
+        </w:rPr>
+        <w:t xml:space="preserve"> </w:t>
+      </w:r>
+      <w:r>
+        <w:rPr>
+          <w:color w:val="D3D7DE"/>
+        </w:rPr>
+        <w:t>(</w:t>
+      </w:r>
+      <w:r>
+        <w:rPr>
+          <w:color w:val="EAECF0"/>
+        </w:rPr>
+        <w:t>el &amp;&amp; el</w:t>
+      </w:r>
+      <w:r>
+        <w:rPr>
+          <w:color w:val="D3D7DE"/>
+        </w:rPr>
+        <w:t>.</w:t>
+      </w:r>
+      <w:r>
+        <w:rPr>
+          <w:color w:val="EAECF0"/>
+        </w:rPr>
+        <w:t xml:space="preserve">tagName === </w:t>
+      </w:r>
+      <w:r>
+        <w:rPr>
+          <w:color w:val="9BE963"/>
+        </w:rPr>
+        <w:t>'IMG'</w:t>
+      </w:r>
+      <w:r>
+        <w:rPr>
+          <w:color w:val="D3D7DE"/>
+        </w:rPr>
+        <w:t>)</w:t>
+      </w:r>
+      <w:r>
+        <w:rPr>
+          <w:color w:val="EAECF0"/>
+        </w:rPr>
+        <w:t xml:space="preserve"> </w:t>
+      </w:r>
+      <w:r>
+        <w:t>return</w:t>
+      </w:r>
+      <w:r>
+        <w:rPr>
+          <w:color w:val="EAECF0"/>
+        </w:rPr>
+        <w:t xml:space="preserve"> el</w:t>
+      </w:r>
+      <w:r>
+        <w:rPr>
+          <w:color w:val="D3D7DE"/>
+        </w:rPr>
+        <w:t>.</w:t>
+      </w:r>
+      <w:r>
+        <w:rPr>
+          <w:color w:val="70B8FF"/>
+        </w:rPr>
+        <w:t>getAttribute</w:t>
+      </w:r>
+      <w:r>
+        <w:rPr>
+          <w:color w:val="D3D7DE"/>
+        </w:rPr>
+        <w:t>(</w:t>
+      </w:r>
+      <w:r>
+        <w:rPr>
+          <w:color w:val="9BE963"/>
+        </w:rPr>
+        <w:t>'src'</w:t>
+      </w:r>
+      <w:r>
+        <w:rPr>
+          <w:color w:val="D3D7DE"/>
+        </w:rPr>
+        <w:t>);</w:t>
+      </w:r>
+    </w:p>
+    <w:p>
+      <w:pPr>
+        <w:pStyle w:val="CONSOLA"/>
+        <w:rPr>
+          <w:color w:val="EAECF0"/>
+        </w:rPr>
+      </w:pPr>
+      <w:r>
+        <w:rPr>
+          <w:color w:val="EAECF0"/>
+        </w:rPr>
+        <w:t xml:space="preserve">  </w:t>
+      </w:r>
+      <w:r>
+        <w:t>if</w:t>
+      </w:r>
+      <w:r>
+        <w:rPr>
+          <w:color w:val="EAECF0"/>
+        </w:rPr>
+        <w:t xml:space="preserve"> </w:t>
+      </w:r>
+      <w:r>
+        <w:rPr>
+          <w:color w:val="D3D7DE"/>
+        </w:rPr>
+        <w:t>(</w:t>
+      </w:r>
+      <w:r>
+        <w:rPr>
+          <w:color w:val="EAECF0"/>
+        </w:rPr>
+        <w:t>el</w:t>
+      </w:r>
+      <w:r>
+        <w:rPr>
+          <w:color w:val="D3D7DE"/>
+        </w:rPr>
+        <w:t>)</w:t>
+      </w:r>
+      <w:r>
+        <w:rPr>
+          <w:color w:val="EAECF0"/>
+        </w:rPr>
+        <w:t xml:space="preserve"> </w:t>
+      </w:r>
+      <w:r>
+        <w:rPr>
+          <w:color w:val="D3D7DE"/>
+        </w:rPr>
+        <w:t>{</w:t>
+      </w:r>
+    </w:p>
+    <w:p>
+      <w:pPr>
+        <w:pStyle w:val="CONSOLA"/>
+        <w:rPr>
+          <w:color w:val="EAECF0"/>
+        </w:rPr>
+      </w:pPr>
+      <w:r>
+        <w:rPr>
+          <w:color w:val="EAECF0"/>
+        </w:rPr>
+        <w:t xml:space="preserve">    </w:t>
+      </w:r>
+      <w:r>
+        <w:t>var</w:t>
+      </w:r>
+      <w:r>
+        <w:rPr>
+          <w:color w:val="EAECF0"/>
+        </w:rPr>
+        <w:t xml:space="preserve"> img = el</w:t>
+      </w:r>
+      <w:r>
+        <w:rPr>
+          <w:color w:val="D3D7DE"/>
+        </w:rPr>
+        <w:t>.</w:t>
+      </w:r>
+      <w:r>
+        <w:rPr>
+          <w:color w:val="70B8FF"/>
+        </w:rPr>
+        <w:t>querySelector</w:t>
+      </w:r>
+      <w:r>
+        <w:rPr>
+          <w:color w:val="D3D7DE"/>
+        </w:rPr>
+        <w:t>(</w:t>
+      </w:r>
+      <w:r>
+        <w:rPr>
+          <w:color w:val="9BE963"/>
+        </w:rPr>
+        <w:t>'img'</w:t>
+      </w:r>
+      <w:r>
+        <w:rPr>
+          <w:color w:val="D3D7DE"/>
+        </w:rPr>
+        <w:t>);</w:t>
+      </w:r>
+    </w:p>
+    <w:p>
+      <w:pPr>
+        <w:pStyle w:val="CONSOLA"/>
+        <w:rPr>
+          <w:color w:val="EAECF0"/>
+        </w:rPr>
+      </w:pPr>
+      <w:r>
+        <w:rPr>
+          <w:color w:val="EAECF0"/>
+        </w:rPr>
+        <w:t xml:space="preserve">    </w:t>
+      </w:r>
+      <w:r>
+        <w:t>if</w:t>
+      </w:r>
+      <w:r>
+        <w:rPr>
+          <w:color w:val="EAECF0"/>
+        </w:rPr>
+        <w:t xml:space="preserve"> </w:t>
+      </w:r>
+      <w:r>
+        <w:rPr>
+          <w:color w:val="D3D7DE"/>
+        </w:rPr>
+        <w:t>(</w:t>
+      </w:r>
+      <w:r>
+        <w:rPr>
+          <w:color w:val="EAECF0"/>
+        </w:rPr>
+        <w:t>img</w:t>
+      </w:r>
+      <w:r>
+        <w:rPr>
+          <w:color w:val="D3D7DE"/>
+        </w:rPr>
+        <w:t>)</w:t>
+      </w:r>
+      <w:r>
+        <w:rPr>
+          <w:color w:val="EAECF0"/>
+        </w:rPr>
+        <w:t xml:space="preserve"> </w:t>
+      </w:r>
+      <w:r>
+        <w:t>return</w:t>
+      </w:r>
+      <w:r>
+        <w:rPr>
+          <w:color w:val="EAECF0"/>
+        </w:rPr>
+        <w:t xml:space="preserve"> img</w:t>
+      </w:r>
+      <w:r>
+        <w:rPr>
+          <w:color w:val="D3D7DE"/>
+        </w:rPr>
+        <w:t>.</w:t>
+      </w:r>
+      <w:r>
+        <w:rPr>
+          <w:color w:val="70B8FF"/>
+        </w:rPr>
+        <w:t>getAttribute</w:t>
+      </w:r>
+      <w:r>
+        <w:rPr>
+          <w:color w:val="D3D7DE"/>
+        </w:rPr>
+        <w:t>(</w:t>
+      </w:r>
+      <w:r>
+        <w:rPr>
+          <w:color w:val="9BE963"/>
+        </w:rPr>
+        <w:t>'src'</w:t>
+      </w:r>
+      <w:r>
+        <w:rPr>
+          <w:color w:val="D3D7DE"/>
+        </w:rPr>
+        <w:t>);</w:t>
+      </w:r>
+    </w:p>
+    <w:p>
+      <w:pPr>
+        <w:pStyle w:val="CONSOLA"/>
+        <w:rPr>
+          <w:color w:val="EAECF0"/>
+        </w:rPr>
+      </w:pPr>
+      <w:r>
+        <w:rPr>
+          <w:color w:val="EAECF0"/>
+        </w:rPr>
+        <w:t xml:space="preserve">  </w:t>
+      </w:r>
+      <w:r>
+        <w:rPr>
+          <w:color w:val="D3D7DE"/>
+        </w:rPr>
+        <w:t>}</w:t>
+      </w:r>
+    </w:p>
+    <w:p>
+      <w:pPr>
+        <w:pStyle w:val="CONSOLA"/>
+        <w:rPr>
+          <w:color w:val="EAECF0"/>
+        </w:rPr>
+      </w:pPr>
+      <w:r>
+        <w:rPr>
+          <w:color w:val="EAECF0"/>
+        </w:rPr>
+        <w:t xml:space="preserve">  </w:t>
+      </w:r>
+      <w:r>
+        <w:t>return</w:t>
+      </w:r>
+      <w:r>
+        <w:rPr>
+          <w:color w:val="EAECF0"/>
+        </w:rPr>
+        <w:t xml:space="preserve"> </w:t>
+      </w:r>
+      <w:r>
+        <w:t>undefined</w:t>
+      </w:r>
+      <w:r>
+        <w:rPr>
+          <w:color w:val="D3D7DE"/>
+        </w:rPr>
+        <w:t>;</w:t>
+      </w:r>
+    </w:p>
+    <w:p>
+      <w:pPr>
+        <w:pStyle w:val="CONSOLA"/>
+        <w:rPr>
+          <w:color w:val="EAECF0"/>
+        </w:rPr>
+      </w:pPr>
+      <w:r>
+        <w:rPr>
+          <w:color w:val="D3D7DE"/>
+        </w:rPr>
+        <w:t>}</w:t>
+      </w:r>
+    </w:p>
+    <w:p>
+      <w:pPr>
+        <w:spacing w:before="100" w:beforeAutospacing="1" w:after="100" w:afterAutospacing="1" w:line="240" w:lineRule="auto"/>
+        <w:rPr>
+          <w:rFonts w:ascii="Times New Roman" w:eastAsia="Times New Roman" w:hAnsi="Times New Roman" w:cs="Times New Roman"/>
+          <w:sz w:val="24"/>
+          <w:szCs w:val="24"/>
+          <w:lang w:eastAsia="es-VE"/>
+        </w:rPr>
+      </w:pPr>
+      <w:r>
+        <w:rPr>
+          <w:rFonts w:ascii="Times New Roman" w:eastAsia="Times New Roman" w:hAnsi="Times New Roman" w:cs="Times New Roman"/>
+          <w:b/>
+          <w:bCs/>
+          <w:sz w:val="24"/>
+          <w:szCs w:val="24"/>
+          <w:lang w:eastAsia="es-VE"/>
+        </w:rPr>
+        <w:t xml:space="preserve">Activador — </w:t>
+      </w:r>
+      <w:r>
+        <w:rPr>
+          <w:rFonts w:ascii="Courier New" w:eastAsia="Times New Roman" w:hAnsi="Courier New" w:cs="Courier New"/>
+          <w:b/>
+          <w:bCs/>
+          <w:sz w:val="20"/>
+          <w:szCs w:val="20"/>
+          <w:lang w:eastAsia="es-VE"/>
+        </w:rPr>
+        <w:t>activador_clic_imagen</w:t>
+      </w:r>
+    </w:p>
+    <w:p>
+      <w:pPr>
+        <w:numPr>
+          <w:ilvl w:val="0"/>
+          <w:numId w:val="11"/>
+        </w:numPr>
+        <w:spacing w:before="100" w:beforeAutospacing="1" w:after="100" w:afterAutospacing="1" w:line="240" w:lineRule="auto"/>
+        <w:rPr>
+          <w:rFonts w:ascii="Times New Roman" w:eastAsia="Times New Roman" w:hAnsi="Times New Roman" w:cs="Times New Roman"/>
+          <w:sz w:val="24"/>
+          <w:szCs w:val="24"/>
+          <w:lang w:eastAsia="es-VE"/>
+        </w:rPr>
+      </w:pPr>
+      <w:r>
+        <w:rPr>
+          <w:rFonts w:ascii="Times New Roman" w:eastAsia="Times New Roman" w:hAnsi="Times New Roman" w:cs="Times New Roman"/>
+          <w:sz w:val="24"/>
+          <w:szCs w:val="24"/>
+          <w:lang w:eastAsia="es-VE"/>
+        </w:rPr>
+        <w:t>Tipo: Clic — Todos los elementos</w:t>
+      </w:r>
+    </w:p>
+    <w:p>
+      <w:pPr>
+        <w:numPr>
+          <w:ilvl w:val="0"/>
+          <w:numId w:val="11"/>
+        </w:numPr>
+        <w:spacing w:before="100" w:beforeAutospacing="1" w:after="100" w:afterAutospacing="1" w:line="240" w:lineRule="auto"/>
+        <w:rPr>
+          <w:rFonts w:ascii="Times New Roman" w:eastAsia="Times New Roman" w:hAnsi="Times New Roman" w:cs="Times New Roman"/>
+          <w:sz w:val="24"/>
+          <w:szCs w:val="24"/>
+          <w:lang w:eastAsia="es-VE"/>
+        </w:rPr>
+      </w:pPr>
+      <w:r>
+        <w:rPr>
+          <w:rFonts w:ascii="Times New Roman" w:eastAsia="Times New Roman" w:hAnsi="Times New Roman" w:cs="Times New Roman"/>
+          <w:sz w:val="24"/>
+          <w:szCs w:val="24"/>
+          <w:lang w:eastAsia="es-VE"/>
+        </w:rPr>
+        <w:t xml:space="preserve">Condición: </w:t>
+      </w:r>
+      <w:r>
+        <w:rPr>
+          <w:rFonts w:ascii="Courier New" w:eastAsia="Times New Roman" w:hAnsi="Courier New" w:cs="Courier New"/>
+          <w:sz w:val="20"/>
+          <w:szCs w:val="20"/>
+          <w:lang w:eastAsia="es-VE"/>
+        </w:rPr>
+        <w:t>Click Element</w:t>
+      </w:r>
+      <w:r>
+        <w:rPr>
+          <w:rFonts w:ascii="Times New Roman" w:eastAsia="Times New Roman" w:hAnsi="Times New Roman" w:cs="Times New Roman"/>
+          <w:sz w:val="24"/>
+          <w:szCs w:val="24"/>
+          <w:lang w:eastAsia="es-VE"/>
+        </w:rPr>
+        <w:t xml:space="preserve"> coincide con selector CSS → </w:t>
+      </w:r>
+      <w:r>
+        <w:rPr>
+          <w:rFonts w:ascii="Courier New" w:eastAsia="Times New Roman" w:hAnsi="Courier New" w:cs="Courier New"/>
+          <w:sz w:val="20"/>
+          <w:szCs w:val="20"/>
+          <w:lang w:eastAsia="es-VE"/>
+        </w:rPr>
+        <w:t>img</w:t>
+      </w:r>
+    </w:p>
+    <w:p>
+      <w:pPr>
+        <w:spacing w:before="100" w:beforeAutospacing="1" w:after="100" w:afterAutospacing="1" w:line="240" w:lineRule="auto"/>
+        <w:rPr>
+          <w:rFonts w:ascii="Times New Roman" w:eastAsia="Times New Roman" w:hAnsi="Times New Roman" w:cs="Times New Roman"/>
+          <w:sz w:val="24"/>
+          <w:szCs w:val="24"/>
+          <w:lang w:eastAsia="es-VE"/>
+        </w:rPr>
+      </w:pPr>
+      <w:r>
+        <w:rPr>
+          <w:rFonts w:ascii="Times New Roman" w:eastAsia="Times New Roman" w:hAnsi="Times New Roman" w:cs="Times New Roman"/>
+          <w:b/>
+          <w:bCs/>
+          <w:sz w:val="24"/>
+          <w:szCs w:val="24"/>
+          <w:lang w:eastAsia="es-VE"/>
+        </w:rPr>
+        <w:t xml:space="preserve">Etiqueta — </w:t>
+      </w:r>
+      <w:r>
+        <w:rPr>
+          <w:rFonts w:ascii="Courier New" w:eastAsia="Times New Roman" w:hAnsi="Courier New" w:cs="Courier New"/>
+          <w:b/>
+          <w:bCs/>
+          <w:sz w:val="20"/>
+          <w:szCs w:val="20"/>
+          <w:lang w:eastAsia="es-VE"/>
+        </w:rPr>
+        <w:t>tag_click_imagen</w:t>
+      </w:r>
+    </w:p>
+    <w:p>
+      <w:pPr>
+        <w:numPr>
+          <w:ilvl w:val="0"/>
+          <w:numId w:val="12"/>
+        </w:numPr>
+        <w:spacing w:before="100" w:beforeAutospacing="1" w:after="100" w:afterAutospacing="1" w:line="240" w:lineRule="auto"/>
+        <w:rPr>
+          <w:rFonts w:ascii="Times New Roman" w:eastAsia="Times New Roman" w:hAnsi="Times New Roman" w:cs="Times New Roman"/>
+          <w:sz w:val="24"/>
+          <w:szCs w:val="24"/>
+          <w:lang w:eastAsia="es-VE"/>
+        </w:rPr>
+      </w:pPr>
+      <w:r>
+        <w:rPr>
+          <w:rFonts w:ascii="Times New Roman" w:eastAsia="Times New Roman" w:hAnsi="Times New Roman" w:cs="Times New Roman"/>
+          <w:sz w:val="24"/>
+          <w:szCs w:val="24"/>
+          <w:lang w:eastAsia="es-VE"/>
+        </w:rPr>
+        <w:t>Tipo: Evento de Google Analytics GA4</w:t>
+      </w:r>
+    </w:p>
+    <w:p>
+      <w:pPr>
+        <w:numPr>
+          <w:ilvl w:val="0"/>
+          <w:numId w:val="12"/>
+        </w:numPr>
+        <w:spacing w:before="100" w:beforeAutospacing="1" w:after="100" w:afterAutospacing="1" w:line="240" w:lineRule="auto"/>
+        <w:rPr>
+          <w:rFonts w:ascii="Times New Roman" w:eastAsia="Times New Roman" w:hAnsi="Times New Roman" w:cs="Times New Roman"/>
+          <w:sz w:val="24"/>
+          <w:szCs w:val="24"/>
+          <w:lang w:eastAsia="es-VE"/>
+        </w:rPr>
+      </w:pPr>
+      <w:r>
+        <w:rPr>
+          <w:rFonts w:ascii="Times New Roman" w:eastAsia="Times New Roman" w:hAnsi="Times New Roman" w:cs="Times New Roman"/>
+          <w:sz w:val="24"/>
+          <w:szCs w:val="24"/>
+          <w:lang w:eastAsia="es-VE"/>
+        </w:rPr>
+        <w:t xml:space="preserve">ID de medición: </w:t>
+      </w:r>
+      <w:r>
+        <w:rPr>
+          <w:rFonts w:ascii="Courier New" w:eastAsia="Times New Roman" w:hAnsi="Courier New" w:cs="Courier New"/>
+          <w:sz w:val="20"/>
+          <w:szCs w:val="20"/>
+          <w:lang w:eastAsia="es-VE"/>
+        </w:rPr>
+        <w:t>G-FJ4232L0</w:t>
+      </w:r>
+    </w:p>
+    <w:p>
+      <w:pPr>
+        <w:numPr>
+          <w:ilvl w:val="0"/>
+          <w:numId w:val="12"/>
+        </w:numPr>
+        <w:spacing w:before="100" w:beforeAutospacing="1" w:after="100" w:afterAutospacing="1" w:line="240" w:lineRule="auto"/>
+        <w:rPr>
+          <w:rFonts w:ascii="Times New Roman" w:eastAsia="Times New Roman" w:hAnsi="Times New Roman" w:cs="Times New Roman"/>
+          <w:sz w:val="24"/>
+          <w:szCs w:val="24"/>
+          <w:lang w:eastAsia="es-VE"/>
+        </w:rPr>
+      </w:pPr>
+      <w:r>
+        <w:rPr>
+          <w:rFonts w:ascii="Times New Roman" w:eastAsia="Times New Roman" w:hAnsi="Times New Roman" w:cs="Times New Roman"/>
+          <w:sz w:val="24"/>
+          <w:szCs w:val="24"/>
+          <w:lang w:eastAsia="es-VE"/>
+        </w:rPr>
+        <w:t xml:space="preserve">Nombre del evento: </w:t>
+      </w:r>
+      <w:r>
+        <w:rPr>
+          <w:rFonts w:ascii="Courier New" w:eastAsia="Times New Roman" w:hAnsi="Courier New" w:cs="Courier New"/>
+          <w:sz w:val="20"/>
+          <w:szCs w:val="20"/>
+          <w:lang w:eastAsia="es-VE"/>
+        </w:rPr>
+        <w:t>click_imagen</w:t>
+      </w:r>
+    </w:p>
+    <w:p>
+      <w:pPr>
+        <w:numPr>
+          <w:ilvl w:val="0"/>
+          <w:numId w:val="12"/>
+        </w:numPr>
+        <w:spacing w:before="100" w:beforeAutospacing="1" w:after="100" w:afterAutospacing="1" w:line="240" w:lineRule="auto"/>
+        <w:rPr>
+          <w:rFonts w:ascii="Times New Roman" w:eastAsia="Times New Roman" w:hAnsi="Times New Roman" w:cs="Times New Roman"/>
+          <w:sz w:val="24"/>
+          <w:szCs w:val="24"/>
+          <w:lang w:eastAsia="es-VE"/>
+        </w:rPr>
+      </w:pPr>
+      <w:r>
+        <w:rPr>
+          <w:rFonts w:ascii="Times New Roman" w:eastAsia="Times New Roman" w:hAnsi="Times New Roman" w:cs="Times New Roman"/>
+          <w:sz w:val="24"/>
+          <w:szCs w:val="24"/>
+          <w:lang w:eastAsia="es-VE"/>
+        </w:rPr>
+        <w:t>Parámetros del evento:</w:t>
+      </w:r>
+    </w:p>
+    <w:tbl>
+      <w:tblPr>
+        <w:tblW w:w="0" w:type="auto"/>
+        <w:tblCellSpacing w:w="15" w:type="dxa"/>
+        <w:tblCellMar>
+          <w:top w:w="15" w:type="dxa"/>
+          <w:left w:w="15" w:type="dxa"/>
+          <w:bottom w:w="15" w:type="dxa"/>
+          <w:right w:w="15" w:type="dxa"/>
+        </w:tblCellMar>
+        <w:tblLook w:val="04A0" w:firstRow="1" w:lastRow="0" w:firstColumn="1" w:lastColumn="0" w:noHBand="0" w:noVBand="1"/>
+      </w:tblPr>
+      <w:tblGrid>
+        <w:gridCol w:w="1636"/>
+        <w:gridCol w:w="2596"/>
+      </w:tblGrid>
+      <w:tr>
+        <w:trPr>
+          <w:tblHeader/>
+          <w:tblCellSpacing w:w="15" w:type="dxa"/>
+        </w:trPr>
+        <w:tc>
+          <w:tcPr>
+            <w:tcW w:w="0" w:type="auto"/>
+            <w:vAlign w:val="center"/>
+            <w:hideMark/>
+          </w:tcPr>
+          <w:p>
+            <w:pPr>
+              <w:spacing w:after="0" w:line="240" w:lineRule="auto"/>
+              <w:jc w:val="center"/>
+              <w:rPr>
+                <w:rFonts w:ascii="Times New Roman" w:eastAsia="Times New Roman" w:hAnsi="Times New Roman" w:cs="Times New Roman"/>
+                <w:b/>
+                <w:bCs/>
+                <w:sz w:val="24"/>
+                <w:szCs w:val="24"/>
+                <w:lang w:eastAsia="es-VE"/>
+              </w:rPr>
+            </w:pPr>
+            <w:r>
+              <w:rPr>
+                <w:rFonts w:ascii="Times New Roman" w:eastAsia="Times New Roman" w:hAnsi="Times New Roman" w:cs="Times New Roman"/>
+                <w:b/>
+                <w:bCs/>
+                <w:sz w:val="24"/>
+                <w:szCs w:val="24"/>
+                <w:lang w:eastAsia="es-VE"/>
+              </w:rPr>
+              <w:t>Nombre</w:t>
+            </w:r>
+          </w:p>
+        </w:tc>
+        <w:tc>
+          <w:tcPr>
+            <w:tcW w:w="0" w:type="auto"/>
+            <w:vAlign w:val="center"/>
+            <w:hideMark/>
+          </w:tcPr>
+          <w:p>
+            <w:pPr>
+              <w:spacing w:after="0" w:line="240" w:lineRule="auto"/>
+              <w:jc w:val="center"/>
+              <w:rPr>
+                <w:rFonts w:ascii="Times New Roman" w:eastAsia="Times New Roman" w:hAnsi="Times New Roman" w:cs="Times New Roman"/>
+                <w:b/>
+                <w:bCs/>
+                <w:sz w:val="24"/>
+                <w:szCs w:val="24"/>
+                <w:lang w:eastAsia="es-VE"/>
+              </w:rPr>
+            </w:pPr>
+            <w:r>
+              <w:rPr>
+                <w:rFonts w:ascii="Times New Roman" w:eastAsia="Times New Roman" w:hAnsi="Times New Roman" w:cs="Times New Roman"/>
+                <w:b/>
+                <w:bCs/>
+                <w:sz w:val="24"/>
+                <w:szCs w:val="24"/>
+                <w:lang w:eastAsia="es-VE"/>
+              </w:rPr>
+              <w:t>Valor</w:t>
+            </w:r>
+          </w:p>
+        </w:tc>
+      </w:tr>
+      <w:tr>
+        <w:trPr>
+          <w:tblCellSpacing w:w="15" w:type="dxa"/>
+        </w:trPr>
+        <w:tc>
+          <w:tcPr>
+            <w:tcW w:w="0" w:type="auto"/>
+            <w:vAlign w:val="center"/>
+            <w:hideMark/>
+          </w:tcPr>
+          <w:p>
+            <w:pPr>
+              <w:spacing w:after="0" w:line="240" w:lineRule="auto"/>
+              <w:rPr>
+                <w:rFonts w:ascii="Times New Roman" w:eastAsia="Times New Roman" w:hAnsi="Times New Roman" w:cs="Times New Roman"/>
+                <w:sz w:val="24"/>
+                <w:szCs w:val="24"/>
+                <w:lang w:eastAsia="es-VE"/>
+              </w:rPr>
+            </w:pPr>
+            <w:r>
+              <w:rPr>
+                <w:rFonts w:ascii="Courier New" w:eastAsia="Times New Roman" w:hAnsi="Courier New" w:cs="Courier New"/>
+                <w:sz w:val="20"/>
+                <w:szCs w:val="20"/>
+                <w:lang w:eastAsia="es-VE"/>
+              </w:rPr>
+              <w:t>titulo_imagen</w:t>
+            </w:r>
+          </w:p>
+        </w:tc>
+        <w:tc>
+          <w:tcPr>
+            <w:tcW w:w="0" w:type="auto"/>
+            <w:vAlign w:val="center"/>
+            <w:hideMark/>
+          </w:tcPr>
+          <w:p>
+            <w:pPr>
+              <w:spacing w:after="0" w:line="240" w:lineRule="auto"/>
+              <w:rPr>
+                <w:rFonts w:ascii="Times New Roman" w:eastAsia="Times New Roman" w:hAnsi="Times New Roman" w:cs="Times New Roman"/>
+                <w:sz w:val="24"/>
+                <w:szCs w:val="24"/>
+                <w:lang w:eastAsia="es-VE"/>
+              </w:rPr>
+            </w:pPr>
+            <w:r>
+              <w:rPr>
+                <w:rFonts w:ascii="Courier New" w:eastAsia="Times New Roman" w:hAnsi="Courier New" w:cs="Courier New"/>
+                <w:sz w:val="20"/>
+                <w:szCs w:val="20"/>
+                <w:lang w:eastAsia="es-VE"/>
+              </w:rPr>
+              <w:t>{{var_titulo_imagen}}</w:t>
+            </w:r>
+          </w:p>
+        </w:tc>
+      </w:tr>
+      <w:tr>
+        <w:trPr>
+          <w:tblCellSpacing w:w="15" w:type="dxa"/>
+        </w:trPr>
+        <w:tc>
+          <w:tcPr>
+            <w:tcW w:w="0" w:type="auto"/>
+            <w:vAlign w:val="center"/>
+            <w:hideMark/>
+          </w:tcPr>
+          <w:p>
+            <w:pPr>
+              <w:spacing w:after="0" w:line="240" w:lineRule="auto"/>
+              <w:rPr>
+                <w:rFonts w:ascii="Times New Roman" w:eastAsia="Times New Roman" w:hAnsi="Times New Roman" w:cs="Times New Roman"/>
+                <w:sz w:val="24"/>
+                <w:szCs w:val="24"/>
+                <w:lang w:eastAsia="es-VE"/>
+              </w:rPr>
+            </w:pPr>
+            <w:r>
+              <w:rPr>
+                <w:rFonts w:ascii="Courier New" w:eastAsia="Times New Roman" w:hAnsi="Courier New" w:cs="Courier New"/>
+                <w:sz w:val="20"/>
+                <w:szCs w:val="20"/>
+                <w:lang w:eastAsia="es-VE"/>
+              </w:rPr>
+              <w:t>url_imagen</w:t>
+            </w:r>
+          </w:p>
+        </w:tc>
+        <w:tc>
+          <w:tcPr>
+            <w:tcW w:w="0" w:type="auto"/>
+            <w:vAlign w:val="center"/>
+            <w:hideMark/>
+          </w:tcPr>
+          <w:p>
+            <w:pPr>
+              <w:spacing w:after="0" w:line="240" w:lineRule="auto"/>
+              <w:rPr>
+                <w:rFonts w:ascii="Times New Roman" w:eastAsia="Times New Roman" w:hAnsi="Times New Roman" w:cs="Times New Roman"/>
+                <w:sz w:val="24"/>
+                <w:szCs w:val="24"/>
+                <w:lang w:eastAsia="es-VE"/>
+              </w:rPr>
+            </w:pPr>
+            <w:r>
+              <w:rPr>
+                <w:rFonts w:ascii="Courier New" w:eastAsia="Times New Roman" w:hAnsi="Courier New" w:cs="Courier New"/>
+                <w:sz w:val="20"/>
+                <w:szCs w:val="20"/>
+                <w:lang w:eastAsia="es-VE"/>
+              </w:rPr>
+              <w:t>{{var_src_imagen}}</w:t>
+            </w:r>
+          </w:p>
+        </w:tc>
+      </w:tr>
+    </w:tbl>
+    <w:p>
+      <w:pPr>
+        <w:numPr>
+          <w:ilvl w:val="0"/>
+          <w:numId w:val="13"/>
+        </w:numPr>
+        <w:spacing w:before="100" w:beforeAutospacing="1" w:after="100" w:afterAutospacing="1" w:line="240" w:lineRule="auto"/>
+        <w:rPr>
+          <w:rFonts w:ascii="Times New Roman" w:eastAsia="Times New Roman" w:hAnsi="Times New Roman" w:cs="Times New Roman"/>
+          <w:sz w:val="24"/>
+          <w:szCs w:val="24"/>
+          <w:lang w:eastAsia="es-VE"/>
+        </w:rPr>
+      </w:pPr>
+      <w:r>
+        <w:rPr>
+          <w:rFonts w:ascii="Times New Roman" w:eastAsia="Times New Roman" w:hAnsi="Times New Roman" w:cs="Times New Roman"/>
+          <w:sz w:val="24"/>
+          <w:szCs w:val="24"/>
+          <w:lang w:eastAsia="es-VE"/>
+        </w:rPr>
+        <w:t xml:space="preserve">Activador: </w:t>
+      </w:r>
+      <w:r>
+        <w:rPr>
+          <w:rFonts w:ascii="Courier New" w:eastAsia="Times New Roman" w:hAnsi="Courier New" w:cs="Courier New"/>
+          <w:sz w:val="20"/>
+          <w:szCs w:val="20"/>
+          <w:lang w:eastAsia="es-VE"/>
+        </w:rPr>
+        <w:t>activador_clic_imagen</w:t>
+      </w:r>
+    </w:p>
+    <w:p>
+      <w:pPr>
+        <w:jc w:val="center"/>
+        <w:rPr>
+          <w:b/>
+          <w:lang w:val="es-ES"/>
+        </w:rPr>
+      </w:pPr>
+      <w:r>
+        <w:rPr>
+          <w:b/>
+          <w:noProof/>
+          <w:lang w:eastAsia="es-VE"/>
+        </w:rPr>
+        <w:lastRenderedPageBreak/>
+        <w:drawing>
+          <wp:inline distT="0" distB="0" distL="0" distR="0">
+            <wp:extent cx="4699591" cy="3641596"/>
+            <wp:effectExtent l="0" t="0" r="6350" b="0"/>
+            <wp:docPr id="2" name="0 Imagen"/>
+            <wp:cNvGraphicFramePr>
+              <a:graphicFrameLocks xmlns:a="http://schemas.openxmlformats.org/drawingml/2006/main" noChangeAspect="1"/>
+            </wp:cNvGraphicFramePr>
+            <a:graphic xmlns:a="http://schemas.openxmlformats.org/drawingml/2006/main">
+              <a:graphicData uri="http://schemas.openxmlformats.org/drawingml/2006/picture">
+                <pic:pic xmlns:pic="http://schemas.openxmlformats.org/drawingml/2006/picture">
+                  <pic:nvPicPr>
+                    <pic:cNvPr id="0" name="Punto 5 evento1.png"/>
+                    <pic:cNvPicPr/>
+                  </pic:nvPicPr>
+                  <pic:blipFill rotWithShape="1">
+                    <a:blip r:embed="rId9" cstate="print">
+                      <a:extLst>
+                        <a:ext uri="{28A0092B-C50C-407E-A947-70E740481C1C}">
+                          <a14:useLocalDpi xmlns:a14="http://schemas.microsoft.com/office/drawing/2010/main" val="0"/>
+                        </a:ext>
+                      </a:extLst>
+                    </a:blip>
+                    <a:srcRect t="11274" r="38447"/>
+                    <a:stretch/>
+                  </pic:blipFill>
+                  <pic:spPr bwMode="auto">
+                    <a:xfrm>
+                      <a:off x="0" y="0"/>
+                      <a:ext cx="4707876" cy="3648016"/>
+                    </a:xfrm>
+                    <a:prstGeom prst="rect">
+                      <a:avLst/>
+                    </a:prstGeom>
+                    <a:ln>
+                      <a:noFill/>
+                    </a:ln>
+                    <a:extLst>
+                      <a:ext uri="{53640926-AAD7-44D8-BBD7-CCE9431645EC}">
+                        <a14:shadowObscured xmlns:a14="http://schemas.microsoft.com/office/drawing/2010/main"/>
+                      </a:ext>
+                    </a:extLst>
+                  </pic:spPr>
+                </pic:pic>
+              </a:graphicData>
+            </a:graphic>
+          </wp:inline>
+        </w:drawing>
+      </w:r>
+    </w:p>
+    <w:p>
+      <w:pPr>
+        <w:rPr>
+          <w:lang w:val="es-ES"/>
+        </w:rPr>
+      </w:pPr>
+    </w:p>
+    <w:p>
+      <w:pPr>
+        <w:jc w:val="center"/>
+        <w:rPr>
+          <w:lang w:val="es-ES"/>
+        </w:rPr>
+      </w:pPr>
+      <w:r>
+        <w:rPr>
+          <w:noProof/>
+          <w:lang w:eastAsia="es-VE"/>
+        </w:rPr>
+        <w:drawing>
+          <wp:inline distT="0" distB="0" distL="0" distR="0">
+            <wp:extent cx="5146158" cy="3936082"/>
+            <wp:effectExtent l="0" t="0" r="0" b="7620"/>
+            <wp:docPr id="5" name="0 Imagen"/>
+            <wp:cNvGraphicFramePr>
+              <a:graphicFrameLocks xmlns:a="http://schemas.openxmlformats.org/drawingml/2006/main" noChangeAspect="1"/>
+            </wp:cNvGraphicFramePr>
+            <a:graphic xmlns:a="http://schemas.openxmlformats.org/drawingml/2006/main">
+              <a:graphicData uri="http://schemas.openxmlformats.org/drawingml/2006/picture">
+                <pic:pic xmlns:pic="http://schemas.openxmlformats.org/drawingml/2006/picture">
+                  <pic:nvPicPr>
+                    <pic:cNvPr id="0" name="Punto 5 evento2.png"/>
+                    <pic:cNvPicPr/>
+                  </pic:nvPicPr>
+                  <pic:blipFill rotWithShape="1">
+                    <a:blip r:embed="rId10">
+                      <a:extLst>
+                        <a:ext uri="{28A0092B-C50C-407E-A947-70E740481C1C}">
+                          <a14:useLocalDpi xmlns:a14="http://schemas.microsoft.com/office/drawing/2010/main" val="0"/>
+                        </a:ext>
+                      </a:extLst>
+                    </a:blip>
+                    <a:srcRect t="11871" r="37500"/>
+                    <a:stretch/>
+                  </pic:blipFill>
+                  <pic:spPr bwMode="auto">
+                    <a:xfrm>
+                      <a:off x="0" y="0"/>
+                      <a:ext cx="5153835" cy="3941954"/>
+                    </a:xfrm>
+                    <a:prstGeom prst="rect">
+                      <a:avLst/>
+                    </a:prstGeom>
+                    <a:ln>
+                      <a:noFill/>
+                    </a:ln>
+                    <a:extLst>
+                      <a:ext uri="{53640926-AAD7-44D8-BBD7-CCE9431645EC}">
+                        <a14:shadowObscured xmlns:a14="http://schemas.microsoft.com/office/drawing/2010/main"/>
+                      </a:ext>
+                    </a:extLst>
+                  </pic:spPr>
+                </pic:pic>
+              </a:graphicData>
+            </a:graphic>
+          </wp:inline>
+        </w:drawing>
+      </w:r>
+    </w:p>
+    <w:p>
+      <w:pPr>
+        <w:rPr>
+          <w:lang w:val="es-ES"/>
+        </w:rPr>
+      </w:pPr>
+      <w:r>
+        <w:rPr>
+          <w:noProof/>
+          <w:lang w:eastAsia="es-VE"/>
+        </w:rPr>
+        <w:lastRenderedPageBreak/>
+        <w:drawing>
+          <wp:inline distT="0" distB="0" distL="0" distR="0" wp14:anchorId="3CF0BC94" wp14:editId="7A7F558D">
+            <wp:extent cx="5612130" cy="4590415"/>
+            <wp:effectExtent l="0" t="0" r="7620" b="635"/>
+            <wp:docPr id="12" name="0 Imagen"/>
+            <wp:cNvGraphicFramePr>
+              <a:graphicFrameLocks xmlns:a="http://schemas.openxmlformats.org/drawingml/2006/main" noChangeAspect="1"/>
+            </wp:cNvGraphicFramePr>
+            <a:graphic xmlns:a="http://schemas.openxmlformats.org/drawingml/2006/main">
+              <a:graphicData uri="http://schemas.openxmlformats.org/drawingml/2006/picture">
+                <pic:pic xmlns:pic="http://schemas.openxmlformats.org/drawingml/2006/picture">
+                  <pic:nvPicPr>
+                    <pic:cNvPr id="0" name="Punto 5 src y title.png"/>
+                    <pic:cNvPicPr/>
+                  </pic:nvPicPr>
+                  <pic:blipFill>
+                    <a:blip r:embed="rId11">
+                      <a:extLst>
+                        <a:ext uri="{28A0092B-C50C-407E-A947-70E740481C1C}">
+                          <a14:useLocalDpi xmlns:a14="http://schemas.microsoft.com/office/drawing/2010/main" val="0"/>
+                        </a:ext>
+                      </a:extLst>
+                    </a:blip>
+                    <a:stretch>
+                      <a:fillRect/>
+                    </a:stretch>
+                  </pic:blipFill>
+                  <pic:spPr>
+                    <a:xfrm>
+                      <a:off x="0" y="0"/>
+                      <a:ext cx="5612130" cy="4590415"/>
+                    </a:xfrm>
+                    <a:prstGeom prst="rect">
+                      <a:avLst/>
+                    </a:prstGeom>
+                  </pic:spPr>
+                </pic:pic>
+              </a:graphicData>
+            </a:graphic>
+          </wp:inline>
+        </w:drawing>
+      </w:r>
+    </w:p>
+    <w:p>
+      <w:pPr>
+        <w:jc w:val="center"/>
+        <w:rPr>
+          <w:lang w:val="es-ES"/>
+        </w:rPr>
+      </w:pPr>
+    </w:p>
+    <w:p>
+      <w:pPr>
+        <w:jc w:val="center"/>
+        <w:rPr>
+          <w:lang w:val="es-ES"/>
+        </w:rPr>
+      </w:pPr>
+    </w:p>
+    <w:p>
+      <w:pPr>
+        <w:jc w:val="center"/>
+        <w:rPr>
+          <w:lang w:val="es-ES"/>
+        </w:rPr>
+      </w:pPr>
+      <w:r>
+        <w:rPr>
+          <w:noProof/>
+          <w:lang w:eastAsia="es-VE"/>
+        </w:rPr>
+        <w:drawing>
+          <wp:inline distT="0" distB="0" distL="0" distR="0">
+            <wp:extent cx="5605153" cy="1508166"/>
+            <wp:effectExtent l="0" t="0" r="0" b="0"/>
+            <wp:docPr id="9" name="0 Imagen"/>
+            <wp:cNvGraphicFramePr>
+              <a:graphicFrameLocks xmlns:a="http://schemas.openxmlformats.org/drawingml/2006/main" noChangeAspect="1"/>
+            </wp:cNvGraphicFramePr>
+            <a:graphic xmlns:a="http://schemas.openxmlformats.org/drawingml/2006/main">
+              <a:graphicData uri="http://schemas.openxmlformats.org/drawingml/2006/picture">
+                <pic:pic xmlns:pic="http://schemas.openxmlformats.org/drawingml/2006/picture">
+                  <pic:nvPicPr>
+                    <pic:cNvPr id="0" name="Punto 5 etiquetas.png"/>
+                    <pic:cNvPicPr/>
+                  </pic:nvPicPr>
+                  <pic:blipFill rotWithShape="1">
+                    <a:blip r:embed="rId12" cstate="print">
+                      <a:extLst>
+                        <a:ext uri="{28A0092B-C50C-407E-A947-70E740481C1C}">
+                          <a14:useLocalDpi xmlns:a14="http://schemas.microsoft.com/office/drawing/2010/main" val="0"/>
+                        </a:ext>
+                      </a:extLst>
+                    </a:blip>
+                    <a:srcRect t="11727" b="38628"/>
+                    <a:stretch/>
+                  </pic:blipFill>
+                  <pic:spPr bwMode="auto">
+                    <a:xfrm>
+                      <a:off x="0" y="0"/>
+                      <a:ext cx="5612130" cy="1510043"/>
+                    </a:xfrm>
+                    <a:prstGeom prst="rect">
+                      <a:avLst/>
+                    </a:prstGeom>
+                    <a:ln>
+                      <a:noFill/>
+                    </a:ln>
+                    <a:extLst>
+                      <a:ext uri="{53640926-AAD7-44D8-BBD7-CCE9431645EC}">
+                        <a14:shadowObscured xmlns:a14="http://schemas.microsoft.com/office/drawing/2010/main"/>
+                      </a:ext>
+                    </a:extLst>
+                  </pic:spPr>
+                </pic:pic>
+              </a:graphicData>
+            </a:graphic>
+          </wp:inline>
+        </w:drawing>
+      </w:r>
+    </w:p>
+    <w:p>
+      <w:pPr>
+        <w:jc w:val="center"/>
+        <w:rPr>
+          <w:lang w:val="es-ES"/>
+        </w:rPr>
+      </w:pPr>
+    </w:p>
+    <w:p>
+      <w:pPr>
+        <w:jc w:val="center"/>
+        <w:rPr>
+          <w:lang w:val="es-ES"/>
+        </w:rPr>
+      </w:pPr>
+    </w:p>
+    <w:p>
+      <w:pPr>
+        <w:jc w:val="center"/>
+        <w:rPr>
+          <w:lang w:val="es-ES"/>
+        </w:rPr>
+      </w:pPr>
+    </w:p>
+    <w:p>
+      <w:pPr>
+        <w:jc w:val="center"/>
+        <w:rPr>
+          <w:lang w:val="es-ES"/>
+        </w:rPr>
+      </w:pPr>
+      <w:r>
+        <w:rPr>
+          <w:noProof/>
+          <w:lang w:eastAsia="es-VE"/>
+        </w:rPr>
+        <w:lastRenderedPageBreak/>
+        <w:drawing>
+          <wp:inline distT="0" distB="0" distL="0" distR="0" wp14:anchorId="7D5A2FFC" wp14:editId="07EFDB66">
+            <wp:extent cx="5605153" cy="1531917"/>
+            <wp:effectExtent l="0" t="0" r="0" b="0"/>
+            <wp:docPr id="8" name="0 Imagen"/>
+            <wp:cNvGraphicFramePr>
+              <a:graphicFrameLocks xmlns:a="http://schemas.openxmlformats.org/drawingml/2006/main" noChangeAspect="1"/>
+            </wp:cNvGraphicFramePr>
+            <a:graphic xmlns:a="http://schemas.openxmlformats.org/drawingml/2006/main">
+              <a:graphicData uri="http://schemas.openxmlformats.org/drawingml/2006/picture">
+                <pic:pic xmlns:pic="http://schemas.openxmlformats.org/drawingml/2006/picture">
+                  <pic:nvPicPr>
+                    <pic:cNvPr id="0" name="Punto 5 activador.png"/>
+                    <pic:cNvPicPr/>
+                  </pic:nvPicPr>
+                  <pic:blipFill rotWithShape="1">
+                    <a:blip r:embed="rId13" cstate="print">
+                      <a:extLst>
+                        <a:ext uri="{28A0092B-C50C-407E-A947-70E740481C1C}">
+                          <a14:useLocalDpi xmlns:a14="http://schemas.microsoft.com/office/drawing/2010/main" val="0"/>
+                        </a:ext>
+                      </a:extLst>
+                    </a:blip>
+                    <a:srcRect t="11693" b="38026"/>
+                    <a:stretch/>
+                  </pic:blipFill>
+                  <pic:spPr bwMode="auto">
+                    <a:xfrm>
+                      <a:off x="0" y="0"/>
+                      <a:ext cx="5612130" cy="1533824"/>
+                    </a:xfrm>
+                    <a:prstGeom prst="rect">
+                      <a:avLst/>
+                    </a:prstGeom>
+                    <a:ln>
+                      <a:noFill/>
+                    </a:ln>
+                    <a:extLst>
+                      <a:ext uri="{53640926-AAD7-44D8-BBD7-CCE9431645EC}">
+                        <a14:shadowObscured xmlns:a14="http://schemas.microsoft.com/office/drawing/2010/main"/>
+                      </a:ext>
+                    </a:extLst>
+                  </pic:spPr>
+                </pic:pic>
+              </a:graphicData>
+            </a:graphic>
+          </wp:inline>
+        </w:drawing>
+      </w:r>
+    </w:p>
+    <w:p>
+      <w:pPr>
+        <w:jc w:val="center"/>
+        <w:rPr>
+          <w:lang w:val="es-ES"/>
+        </w:rPr>
+      </w:pPr>
+    </w:p>
+    <w:p>
+      <w:pPr>
+        <w:jc w:val="center"/>
+        <w:rPr>
+          <w:lang w:val="es-ES"/>
+        </w:rPr>
+      </w:pPr>
+    </w:p>
+    <w:p>
+      <w:pPr>
+        <w:jc w:val="center"/>
+        <w:rPr>
+          <w:lang w:val="es-ES"/>
+        </w:rPr>
+      </w:pPr>
+      <w:r>
+        <w:rPr>
+          <w:noProof/>
+          <w:lang w:eastAsia="es-VE"/>
+        </w:rPr>
+        <w:drawing>
+          <wp:inline distT="0" distB="0" distL="0" distR="0">
+            <wp:extent cx="5603705" cy="2683823"/>
+            <wp:effectExtent l="0" t="0" r="0" b="2540"/>
+            <wp:docPr id="11" name="0 Imagen"/>
+            <wp:cNvGraphicFramePr>
+              <a:graphicFrameLocks xmlns:a="http://schemas.openxmlformats.org/drawingml/2006/main" noChangeAspect="1"/>
+            </wp:cNvGraphicFramePr>
+            <a:graphic xmlns:a="http://schemas.openxmlformats.org/drawingml/2006/main">
+              <a:graphicData uri="http://schemas.openxmlformats.org/drawingml/2006/picture">
+                <pic:pic xmlns:pic="http://schemas.openxmlformats.org/drawingml/2006/picture">
+                  <pic:nvPicPr>
+                    <pic:cNvPr id="0" name="Punto 5 variables.png"/>
+                    <pic:cNvPicPr/>
+                  </pic:nvPicPr>
+                  <pic:blipFill rotWithShape="1">
+                    <a:blip r:embed="rId14" cstate="print">
+                      <a:extLst>
+                        <a:ext uri="{28A0092B-C50C-407E-A947-70E740481C1C}">
+                          <a14:useLocalDpi xmlns:a14="http://schemas.microsoft.com/office/drawing/2010/main" val="0"/>
+                        </a:ext>
+                      </a:extLst>
+                    </a:blip>
+                    <a:srcRect t="11373"/>
+                    <a:stretch/>
+                  </pic:blipFill>
+                  <pic:spPr bwMode="auto">
+                    <a:xfrm>
+                      <a:off x="0" y="0"/>
+                      <a:ext cx="5612130" cy="2687858"/>
+                    </a:xfrm>
+                    <a:prstGeom prst="rect">
+                      <a:avLst/>
+                    </a:prstGeom>
+                    <a:ln>
+                      <a:noFill/>
+                    </a:ln>
+                    <a:extLst>
+                      <a:ext uri="{53640926-AAD7-44D8-BBD7-CCE9431645EC}">
+                        <a14:shadowObscured xmlns:a14="http://schemas.microsoft.com/office/drawing/2010/main"/>
+                      </a:ext>
+                    </a:extLst>
+                  </pic:spPr>
+                </pic:pic>
+              </a:graphicData>
+            </a:graphic>
+          </wp:inline>
+        </w:drawing>
+      </w:r>
+    </w:p>
+    <w:p>
+      <w:pPr>
+        <w:rPr>
+          <w:lang w:val="es-ES"/>
+        </w:rPr>
+      </w:pPr>
+      <w:r>
+        <w:rPr>
+          <w:lang w:val="es-ES"/>
+        </w:rPr>
+        <w:br w:type="page"/>
+      </w:r>
+    </w:p>
+    <w:p>
+      <w:pPr>
+        <w:spacing w:before="100" w:beforeAutospacing="1" w:after="100" w:afterAutospacing="1" w:line="240" w:lineRule="auto"/>
+        <w:outlineLvl w:val="2"/>
+        <w:rPr>
+          <w:rFonts w:ascii="Times New Roman" w:eastAsia="Times New Roman" w:hAnsi="Times New Roman" w:cs="Times New Roman"/>
+          <w:b/>
+          <w:bCs/>
+          <w:sz w:val="27"/>
+          <w:szCs w:val="27"/>
+          <w:lang w:eastAsia="es-VE"/>
+        </w:rPr>
+      </w:pPr>
+      <w:r>
+        <w:rPr>
+          <w:rFonts w:ascii="Times New Roman" w:eastAsia="Times New Roman" w:hAnsi="Times New Roman" w:cs="Times New Roman"/>
+          <w:sz w:val="24"/>
+          <w:szCs w:val="24"/>
+          <w:lang w:eastAsia="es-VE"/>
+        </w:rPr>
+        <w:lastRenderedPageBreak/>
+        <w:pict>
+          <v:rect id="_x0000_i1030" style="width:0;height:1.5pt" o:hralign="center" o:hrstd="t" o:hr="t" fillcolor="#a0a0a0" stroked="f"/>
+        </w:pict>
+      </w:r>
+    </w:p>
+    <w:p>
+      <w:pPr>
+        <w:spacing w:before="100" w:beforeAutospacing="1" w:after="100" w:afterAutospacing="1" w:line="240" w:lineRule="auto"/>
+        <w:outlineLvl w:val="2"/>
+        <w:rPr>
+          <w:rFonts w:ascii="Times New Roman" w:eastAsia="Times New Roman" w:hAnsi="Times New Roman" w:cs="Times New Roman"/>
+          <w:b/>
+          <w:bCs/>
+          <w:sz w:val="27"/>
+          <w:szCs w:val="27"/>
+          <w:lang w:eastAsia="es-VE"/>
+        </w:rPr>
+      </w:pPr>
+      <w:r>
+        <w:rPr>
+          <w:rFonts w:ascii="Times New Roman" w:eastAsia="Times New Roman" w:hAnsi="Times New Roman" w:cs="Times New Roman"/>
+          <w:b/>
+          <w:bCs/>
+          <w:sz w:val="27"/>
+          <w:szCs w:val="27"/>
+          <w:lang w:eastAsia="es-VE"/>
+        </w:rPr>
+        <w:t>Punto 6 — ¿Es necesaria la Etiqueta de Google?</w:t>
+      </w:r>
+    </w:p>
+    <w:p>
+      <w:pPr>
+        <w:spacing w:before="100" w:beforeAutospacing="1" w:after="100" w:afterAutospacing="1" w:line="240" w:lineRule="auto"/>
+        <w:rPr>
+          <w:rFonts w:ascii="Times New Roman" w:eastAsia="Times New Roman" w:hAnsi="Times New Roman" w:cs="Times New Roman"/>
+          <w:sz w:val="24"/>
+          <w:szCs w:val="24"/>
+          <w:lang w:eastAsia="es-VE"/>
+        </w:rPr>
+      </w:pPr>
+      <w:r>
+        <w:rPr>
+          <w:rFonts w:ascii="Times New Roman" w:eastAsia="Times New Roman" w:hAnsi="Times New Roman" w:cs="Times New Roman"/>
+          <w:b/>
+          <w:bCs/>
+          <w:sz w:val="24"/>
+          <w:szCs w:val="24"/>
+          <w:lang w:eastAsia="es-VE"/>
+        </w:rPr>
+        <w:t>Sí, es necesaria.</w:t>
+      </w:r>
+    </w:p>
+    <w:p>
+      <w:pPr>
+        <w:spacing w:before="100" w:beforeAutospacing="1" w:after="100" w:afterAutospacing="1" w:line="240" w:lineRule="auto"/>
+        <w:rPr>
+          <w:rFonts w:ascii="Times New Roman" w:eastAsia="Times New Roman" w:hAnsi="Times New Roman" w:cs="Times New Roman"/>
+          <w:sz w:val="24"/>
+          <w:szCs w:val="24"/>
+          <w:lang w:eastAsia="es-VE"/>
+        </w:rPr>
+      </w:pPr>
+      <w:r>
+        <w:rPr>
+          <w:rFonts w:ascii="Times New Roman" w:eastAsia="Times New Roman" w:hAnsi="Times New Roman" w:cs="Times New Roman"/>
+          <w:sz w:val="24"/>
+          <w:szCs w:val="24"/>
+          <w:lang w:eastAsia="es-VE"/>
+        </w:rPr>
+        <w:t>Aunque el sitio ya tiene instalado el flujo de datos de GA4, la Etiqueta de Google (</w:t>
+      </w:r>
+      <w:r>
+        <w:rPr>
+          <w:rFonts w:ascii="Courier New" w:eastAsia="Times New Roman" w:hAnsi="Courier New" w:cs="Courier New"/>
+          <w:sz w:val="20"/>
+          <w:szCs w:val="20"/>
+          <w:lang w:eastAsia="es-VE"/>
+        </w:rPr>
+        <w:t>G-FJ4232L0</w:t>
+      </w:r>
+      <w:r>
+        <w:rPr>
+          <w:rFonts w:ascii="Times New Roman" w:eastAsia="Times New Roman" w:hAnsi="Times New Roman" w:cs="Times New Roman"/>
+          <w:sz w:val="24"/>
+          <w:szCs w:val="24"/>
+          <w:lang w:eastAsia="es-VE"/>
+        </w:rPr>
+        <w:t xml:space="preserve">) es el conector base que inicializa la librería </w:t>
+      </w:r>
+      <w:r>
+        <w:rPr>
+          <w:rFonts w:ascii="Courier New" w:eastAsia="Times New Roman" w:hAnsi="Courier New" w:cs="Courier New"/>
+          <w:sz w:val="20"/>
+          <w:szCs w:val="20"/>
+          <w:lang w:eastAsia="es-VE"/>
+        </w:rPr>
+        <w:t>gtag.js</w:t>
+      </w:r>
+      <w:r>
+        <w:rPr>
+          <w:rFonts w:ascii="Times New Roman" w:eastAsia="Times New Roman" w:hAnsi="Times New Roman" w:cs="Times New Roman"/>
+          <w:sz w:val="24"/>
+          <w:szCs w:val="24"/>
+          <w:lang w:eastAsia="es-VE"/>
+        </w:rPr>
+        <w:t xml:space="preserve"> y establece la conexión con el flujo de datos. Sin ella, las etiquetas de evento como </w:t>
+      </w:r>
+      <w:r>
+        <w:rPr>
+          <w:rFonts w:ascii="Courier New" w:eastAsia="Times New Roman" w:hAnsi="Courier New" w:cs="Courier New"/>
+          <w:sz w:val="20"/>
+          <w:szCs w:val="20"/>
+          <w:lang w:eastAsia="es-VE"/>
+        </w:rPr>
+        <w:t>tag_click_imagen</w:t>
+      </w:r>
+      <w:r>
+        <w:rPr>
+          <w:rFonts w:ascii="Times New Roman" w:eastAsia="Times New Roman" w:hAnsi="Times New Roman" w:cs="Times New Roman"/>
+          <w:sz w:val="24"/>
+          <w:szCs w:val="24"/>
+          <w:lang w:eastAsia="es-VE"/>
+        </w:rPr>
+        <w:t xml:space="preserve"> no tienen referencia a qué propiedad reportar y los eventos no llegan a Analytics. GTM mismo lo advierte con un warning cuando falta esta etiqueta.</w:t>
+      </w:r>
+    </w:p>
+    <w:p>
+      <w:pPr>
+        <w:spacing w:before="100" w:beforeAutospacing="1" w:after="100" w:afterAutospacing="1" w:line="240" w:lineRule="auto"/>
+        <w:rPr>
+          <w:rFonts w:ascii="Times New Roman" w:eastAsia="Times New Roman" w:hAnsi="Times New Roman" w:cs="Times New Roman"/>
+          <w:sz w:val="24"/>
+          <w:szCs w:val="24"/>
+          <w:lang w:eastAsia="es-VE"/>
+        </w:rPr>
+      </w:pPr>
+      <w:r>
+        <w:rPr>
+          <w:rFonts w:ascii="Times New Roman" w:eastAsia="Times New Roman" w:hAnsi="Times New Roman" w:cs="Times New Roman"/>
+          <w:b/>
+          <w:bCs/>
+          <w:sz w:val="24"/>
+          <w:szCs w:val="24"/>
+          <w:lang w:eastAsia="es-VE"/>
+        </w:rPr>
+        <w:t>Configuración:</w:t>
+      </w:r>
+    </w:p>
+    <w:p>
+      <w:pPr>
+        <w:numPr>
+          <w:ilvl w:val="0"/>
+          <w:numId w:val="14"/>
+        </w:numPr>
+        <w:spacing w:before="100" w:beforeAutospacing="1" w:after="100" w:afterAutospacing="1" w:line="240" w:lineRule="auto"/>
+        <w:rPr>
+          <w:rFonts w:ascii="Times New Roman" w:eastAsia="Times New Roman" w:hAnsi="Times New Roman" w:cs="Times New Roman"/>
+          <w:sz w:val="24"/>
+          <w:szCs w:val="24"/>
+          <w:lang w:eastAsia="es-VE"/>
+        </w:rPr>
+      </w:pPr>
+      <w:r>
+        <w:rPr>
+          <w:rFonts w:ascii="Times New Roman" w:eastAsia="Times New Roman" w:hAnsi="Times New Roman" w:cs="Times New Roman"/>
+          <w:sz w:val="24"/>
+          <w:szCs w:val="24"/>
+          <w:lang w:eastAsia="es-VE"/>
+        </w:rPr>
+        <w:t>Tipo: Etiqueta de Google</w:t>
+      </w:r>
+    </w:p>
+    <w:p>
+      <w:pPr>
+        <w:numPr>
+          <w:ilvl w:val="0"/>
+          <w:numId w:val="14"/>
+        </w:numPr>
+        <w:spacing w:before="100" w:beforeAutospacing="1" w:after="100" w:afterAutospacing="1" w:line="240" w:lineRule="auto"/>
+        <w:rPr>
+          <w:rFonts w:ascii="Times New Roman" w:eastAsia="Times New Roman" w:hAnsi="Times New Roman" w:cs="Times New Roman"/>
+          <w:sz w:val="24"/>
+          <w:szCs w:val="24"/>
+          <w:lang w:eastAsia="es-VE"/>
+        </w:rPr>
+      </w:pPr>
+      <w:r>
+        <w:rPr>
+          <w:rFonts w:ascii="Times New Roman" w:eastAsia="Times New Roman" w:hAnsi="Times New Roman" w:cs="Times New Roman"/>
+          <w:sz w:val="24"/>
+          <w:szCs w:val="24"/>
+          <w:lang w:eastAsia="es-VE"/>
+        </w:rPr>
+        <w:t xml:space="preserve">ID de etiqueta: </w:t>
+      </w:r>
+      <w:r>
+        <w:rPr>
+          <w:rFonts w:ascii="Courier New" w:eastAsia="Times New Roman" w:hAnsi="Courier New" w:cs="Courier New"/>
+          <w:sz w:val="20"/>
+          <w:szCs w:val="20"/>
+          <w:lang w:eastAsia="es-VE"/>
+        </w:rPr>
+        <w:t>G-FJ4232L0</w:t>
+      </w:r>
+    </w:p>
+    <w:p>
+      <w:pPr>
+        <w:numPr>
+          <w:ilvl w:val="0"/>
+          <w:numId w:val="14"/>
+        </w:numPr>
+        <w:spacing w:before="100" w:beforeAutospacing="1" w:after="100" w:afterAutospacing="1" w:line="240" w:lineRule="auto"/>
+        <w:rPr>
+          <w:rFonts w:ascii="Times New Roman" w:eastAsia="Times New Roman" w:hAnsi="Times New Roman" w:cs="Times New Roman"/>
+          <w:sz w:val="24"/>
+          <w:szCs w:val="24"/>
+          <w:lang w:eastAsia="es-VE"/>
+        </w:rPr>
+      </w:pPr>
+      <w:r>
+        <w:rPr>
+          <w:rFonts w:ascii="Times New Roman" w:eastAsia="Times New Roman" w:hAnsi="Times New Roman" w:cs="Times New Roman"/>
+          <w:sz w:val="24"/>
+          <w:szCs w:val="24"/>
+          <w:lang w:eastAsia="es-VE"/>
+        </w:rPr>
+        <w:t>Activador: Todas las páginas</w:t>
+      </w:r>
+    </w:p>
+    <w:p>
+      <w:pPr>
+        <w:jc w:val="center"/>
+        <w:rPr>
+          <w:lang w:val="es-ES"/>
+        </w:rPr>
+      </w:pPr>
+      <w:r>
+        <w:rPr>
+          <w:noProof/>
+          <w:lang w:eastAsia="es-VE"/>
+        </w:rPr>
+        <w:drawing>
+          <wp:inline distT="0" distB="0" distL="0" distR="0">
+            <wp:extent cx="5612130" cy="1945005"/>
+            <wp:effectExtent l="0" t="0" r="7620" b="0"/>
+            <wp:docPr id="14" name="0 Imagen"/>
+            <wp:cNvGraphicFramePr>
+              <a:graphicFrameLocks xmlns:a="http://schemas.openxmlformats.org/drawingml/2006/main" noChangeAspect="1"/>
+            </wp:cNvGraphicFramePr>
+            <a:graphic xmlns:a="http://schemas.openxmlformats.org/drawingml/2006/main">
+              <a:graphicData uri="http://schemas.openxmlformats.org/drawingml/2006/picture">
+                <pic:pic xmlns:pic="http://schemas.openxmlformats.org/drawingml/2006/picture">
+                  <pic:nvPicPr>
+                    <pic:cNvPr id="0" name="Punto 6.png"/>
+                    <pic:cNvPicPr/>
+                  </pic:nvPicPr>
+                  <pic:blipFill>
+                    <a:blip r:embed="rId15" cstate="print">
+                      <a:extLst>
+                        <a:ext uri="{28A0092B-C50C-407E-A947-70E740481C1C}">
+                          <a14:useLocalDpi xmlns:a14="http://schemas.microsoft.com/office/drawing/2010/main" val="0"/>
+                        </a:ext>
+                      </a:extLst>
+                    </a:blip>
+                    <a:stretch>
+                      <a:fillRect/>
+                    </a:stretch>
+                  </pic:blipFill>
+                  <pic:spPr>
+                    <a:xfrm>
+                      <a:off x="0" y="0"/>
+                      <a:ext cx="5612130" cy="1945005"/>
+                    </a:xfrm>
+                    <a:prstGeom prst="rect">
+                      <a:avLst/>
+                    </a:prstGeom>
+                  </pic:spPr>
+                </pic:pic>
+              </a:graphicData>
+            </a:graphic>
+          </wp:inline>
+        </w:drawing>
+      </w:r>
+    </w:p>
+    <w:p>
+      <w:pPr>
+        <w:jc w:val="center"/>
+        <w:rPr>
+          <w:rFonts w:ascii="Times New Roman" w:eastAsia="Times New Roman" w:hAnsi="Times New Roman" w:cs="Times New Roman"/>
+          <w:sz w:val="24"/>
+          <w:szCs w:val="24"/>
+          <w:lang w:eastAsia="es-VE"/>
+        </w:rPr>
+      </w:pPr>
+      <w:r>
+        <w:rPr>
+          <w:rFonts w:ascii="Times New Roman" w:eastAsia="Times New Roman" w:hAnsi="Times New Roman" w:cs="Times New Roman"/>
+          <w:sz w:val="24"/>
+          <w:szCs w:val="24"/>
+          <w:lang w:eastAsia="es-VE"/>
+        </w:rPr>
+        <w:pict>
+          <v:rect id="_x0000_i1031" style="width:0;height:1.5pt" o:hralign="center" o:hrstd="t" o:hr="t" fillcolor="#a0a0a0" stroked="f"/>
+        </w:pict>
+      </w:r>
+    </w:p>
+    <w:p>
+      <w:pPr>
+        <w:pStyle w:val="Ttulo3"/>
+      </w:pPr>
+      <w:r>
+        <w:t>Punto 7 — ¿Para qué sirven los dataLayer en GTM?</w:t>
+      </w:r>
+    </w:p>
+    <w:p>
+      <w:pPr>
+        <w:pStyle w:val="font-claude-response-body"/>
+      </w:pPr>
+      <w:r>
+        <w:t xml:space="preserve">El </w:t>
+      </w:r>
+      <w:r>
+        <w:rPr>
+          <w:rStyle w:val="CdigoHTML"/>
+        </w:rPr>
+        <w:t>dataLayer</w:t>
+      </w:r>
+      <w:r>
+        <w:t xml:space="preserve"> es un arreglo de JavaScript que actúa como canal de comunicación entre el sitio web y GTM. Permite enviar información estructurada desde el código del sitio hacia GTM para que pueda ser usada en variables, activadores y etiquetas sin necesidad de modificar directamente el código de tracking.</w:t>
+      </w:r>
+    </w:p>
+    <w:p>
+      <w:pPr>
+        <w:pStyle w:val="font-claude-response-body"/>
+        <w:rPr>
+          <w:rStyle w:val="Textoennegrita"/>
+        </w:rPr>
+      </w:pPr>
+    </w:p>
+    <w:p>
+      <w:pPr>
+        <w:pStyle w:val="font-claude-response-body"/>
+        <w:rPr>
+          <w:rStyle w:val="Textoennegrita"/>
+        </w:rPr>
+      </w:pPr>
+    </w:p>
+    <w:p>
+      <w:pPr>
+        <w:pStyle w:val="font-claude-response-body"/>
+        <w:rPr>
+          <w:rStyle w:val="Textoennegrita"/>
+        </w:rPr>
+      </w:pPr>
+    </w:p>
+    <w:p>
+      <w:pPr>
+        <w:pStyle w:val="font-claude-response-body"/>
+        <w:rPr>
+          <w:rStyle w:val="Textoennegrita"/>
+        </w:rPr>
+      </w:pPr>
+    </w:p>
+    <w:p>
+      <w:pPr>
+        <w:pStyle w:val="font-claude-response-body"/>
+      </w:pPr>
+      <w:r>
+        <w:rPr>
+          <w:rStyle w:val="Textoennegrita"/>
+        </w:rPr>
+        <w:lastRenderedPageBreak/>
+        <w:t>Ejemplo de dataLayer:</w:t>
+      </w:r>
+    </w:p>
+    <w:p>
+      <w:r>
+        <w:t>javascript</w:t>
+      </w:r>
+    </w:p>
+    <w:p>
+      <w:pPr>
+        <w:pStyle w:val="CONSOLA"/>
+        <w:rPr>
+          <w:rStyle w:val="CdigoHTML"/>
+          <w:rFonts w:ascii="Consolas" w:hAnsi="Consolas"/>
+        </w:rPr>
+      </w:pPr>
+      <w:r>
+        <w:rPr>
+          <w:rStyle w:val="token"/>
+        </w:rPr>
+        <w:t>window.dataLayer</w:t>
+      </w:r>
+      <w:r>
+        <w:rPr>
+          <w:rStyle w:val="CdigoHTML"/>
+          <w:rFonts w:ascii="Consolas" w:hAnsi="Consolas"/>
+        </w:rPr>
+        <w:t xml:space="preserve"> </w:t>
+      </w:r>
+      <w:r>
+        <w:rPr>
+          <w:rStyle w:val="token"/>
+        </w:rPr>
+        <w:t>=</w:t>
+      </w:r>
+      <w:r>
+        <w:rPr>
+          <w:rStyle w:val="CdigoHTML"/>
+          <w:rFonts w:ascii="Consolas" w:hAnsi="Consolas"/>
+        </w:rPr>
+        <w:t xml:space="preserve"> </w:t>
+      </w:r>
+      <w:r>
+        <w:rPr>
+          <w:rStyle w:val="token"/>
+        </w:rPr>
+        <w:t>window.dataLayer</w:t>
+      </w:r>
+      <w:r>
+        <w:rPr>
+          <w:rStyle w:val="CdigoHTML"/>
+          <w:rFonts w:ascii="Consolas" w:hAnsi="Consolas"/>
+        </w:rPr>
+        <w:t xml:space="preserve"> </w:t>
+      </w:r>
+      <w:r>
+        <w:rPr>
+          <w:rStyle w:val="token"/>
+        </w:rPr>
+        <w:t>||</w:t>
+      </w:r>
+      <w:r>
+        <w:rPr>
+          <w:rStyle w:val="CdigoHTML"/>
+          <w:rFonts w:ascii="Consolas" w:hAnsi="Consolas"/>
+        </w:rPr>
+        <w:t xml:space="preserve"> </w:t>
+      </w:r>
+      <w:r>
+        <w:rPr>
+          <w:rStyle w:val="token"/>
+        </w:rPr>
+        <w:t>[];</w:t>
+      </w:r>
+    </w:p>
+    <w:p>
+      <w:pPr>
+        <w:pStyle w:val="CONSOLA"/>
+        <w:rPr>
+          <w:rStyle w:val="CdigoHTML"/>
+          <w:rFonts w:ascii="Consolas" w:hAnsi="Consolas"/>
+        </w:rPr>
+      </w:pPr>
+      <w:r>
+        <w:rPr>
+          <w:rStyle w:val="token"/>
+        </w:rPr>
+        <w:t>window.dataLayer.push({</w:t>
+      </w:r>
+    </w:p>
+    <w:p>
+      <w:pPr>
+        <w:pStyle w:val="CONSOLA"/>
+        <w:rPr>
+          <w:rStyle w:val="CdigoHTML"/>
+          <w:rFonts w:ascii="Consolas" w:hAnsi="Consolas"/>
+        </w:rPr>
+      </w:pPr>
+      <w:r>
+        <w:rPr>
+          <w:rStyle w:val="CdigoHTML"/>
+          <w:rFonts w:ascii="Consolas" w:hAnsi="Consolas"/>
+        </w:rPr>
+        <w:t xml:space="preserve">    </w:t>
+      </w:r>
+      <w:r>
+        <w:rPr>
+          <w:rStyle w:val="token"/>
+        </w:rPr>
+        <w:t>'event':</w:t>
+      </w:r>
+      <w:r>
+        <w:rPr>
+          <w:rStyle w:val="CdigoHTML"/>
+          <w:rFonts w:ascii="Consolas" w:hAnsi="Consolas"/>
+        </w:rPr>
+        <w:t xml:space="preserve"> </w:t>
+      </w:r>
+      <w:r>
+        <w:rPr>
+          <w:rStyle w:val="token"/>
+        </w:rPr>
+        <w:t>'formulario_enviado',</w:t>
+      </w:r>
+    </w:p>
+    <w:p>
+      <w:pPr>
+        <w:pStyle w:val="CONSOLA"/>
+        <w:rPr>
+          <w:rStyle w:val="CdigoHTML"/>
+          <w:rFonts w:ascii="Consolas" w:hAnsi="Consolas"/>
+        </w:rPr>
+      </w:pPr>
+      <w:r>
+        <w:rPr>
+          <w:rStyle w:val="CdigoHTML"/>
+          <w:rFonts w:ascii="Consolas" w:hAnsi="Consolas"/>
+        </w:rPr>
+        <w:t xml:space="preserve">    </w:t>
+      </w:r>
+      <w:r>
+        <w:rPr>
+          <w:rStyle w:val="token"/>
+        </w:rPr>
+        <w:t>'nombre_usuario':</w:t>
+      </w:r>
+      <w:r>
+        <w:rPr>
+          <w:rStyle w:val="CdigoHTML"/>
+          <w:rFonts w:ascii="Consolas" w:hAnsi="Consolas"/>
+        </w:rPr>
+        <w:t xml:space="preserve"> </w:t>
+      </w:r>
+      <w:r>
+        <w:rPr>
+          <w:rStyle w:val="token"/>
+        </w:rPr>
+        <w:t>'Juan Pérez',</w:t>
+      </w:r>
+    </w:p>
+    <w:p>
+      <w:pPr>
+        <w:pStyle w:val="CONSOLA"/>
+        <w:rPr>
+          <w:rStyle w:val="CdigoHTML"/>
+          <w:rFonts w:ascii="Consolas" w:hAnsi="Consolas"/>
+        </w:rPr>
+      </w:pPr>
+      <w:r>
+        <w:rPr>
+          <w:rStyle w:val="CdigoHTML"/>
+          <w:rFonts w:ascii="Consolas" w:hAnsi="Consolas"/>
+        </w:rPr>
+        <w:t xml:space="preserve">    </w:t>
+      </w:r>
+      <w:r>
+        <w:rPr>
+          <w:rStyle w:val="token"/>
+        </w:rPr>
+        <w:t>'plan_seleccionado':</w:t>
+      </w:r>
+      <w:r>
+        <w:rPr>
+          <w:rStyle w:val="CdigoHTML"/>
+          <w:rFonts w:ascii="Consolas" w:hAnsi="Consolas"/>
+        </w:rPr>
+        <w:t xml:space="preserve"> </w:t>
+      </w:r>
+      <w:r>
+        <w:rPr>
+          <w:rStyle w:val="token"/>
+        </w:rPr>
+        <w:t>'Premium',</w:t>
+      </w:r>
+    </w:p>
+    <w:p>
+      <w:pPr>
+        <w:pStyle w:val="CONSOLA"/>
+        <w:rPr>
+          <w:rStyle w:val="CdigoHTML"/>
+          <w:rFonts w:ascii="Consolas" w:hAnsi="Consolas"/>
+        </w:rPr>
+      </w:pPr>
+      <w:r>
+        <w:rPr>
+          <w:rStyle w:val="CdigoHTML"/>
+          <w:rFonts w:ascii="Consolas" w:hAnsi="Consolas"/>
+        </w:rPr>
+        <w:t xml:space="preserve">    </w:t>
+      </w:r>
+      <w:r>
+        <w:rPr>
+          <w:rStyle w:val="token"/>
+        </w:rPr>
+        <w:t>'valor':</w:t>
+      </w:r>
+      <w:r>
+        <w:rPr>
+          <w:rStyle w:val="CdigoHTML"/>
+          <w:rFonts w:ascii="Consolas" w:hAnsi="Consolas"/>
+        </w:rPr>
+        <w:t xml:space="preserve"> </w:t>
+      </w:r>
+      <w:r>
+        <w:rPr>
+          <w:rStyle w:val="token"/>
+        </w:rPr>
+        <w:t>150000</w:t>
+      </w:r>
+    </w:p>
+    <w:p>
+      <w:pPr>
+        <w:pStyle w:val="CONSOLA"/>
+      </w:pPr>
+      <w:r>
+        <w:rPr>
+          <w:rStyle w:val="token"/>
+        </w:rPr>
+        <w:t>});</w:t>
+      </w:r>
+    </w:p>
+    <w:p>
+      <w:pPr>
+        <w:pStyle w:val="font-claude-response-body"/>
+      </w:pPr>
+      <w:r>
+        <w:t xml:space="preserve">En GTM se crearía una variable de tipo </w:t>
+      </w:r>
+      <w:r>
+        <w:rPr>
+          <w:rStyle w:val="Textoennegrita"/>
+        </w:rPr>
+        <w:t>Variable de capa de datos</w:t>
+      </w:r>
+      <w:r>
+        <w:t xml:space="preserve"> apuntando a </w:t>
+      </w:r>
+      <w:r>
+        <w:rPr>
+          <w:rStyle w:val="CdigoHTML"/>
+        </w:rPr>
+        <w:t>nombre_usuario</w:t>
+      </w:r>
+      <w:r>
+        <w:t xml:space="preserve"> o </w:t>
+      </w:r>
+      <w:r>
+        <w:rPr>
+          <w:rStyle w:val="CdigoHTML"/>
+        </w:rPr>
+        <w:t>plan_seleccionado</w:t>
+      </w:r>
+      <w:r>
+        <w:t xml:space="preserve"> para usarlas como parámetros en una etiqueta GA4.</w:t>
+      </w:r>
+    </w:p>
+    <w:p>
+      <w:pPr>
+        <w:jc w:val="center"/>
+        <w:rPr>
+          <w:lang w:val="es-ES"/>
+        </w:rPr>
+      </w:pPr>
+      <w:r>
+        <w:rPr>
+          <w:rFonts w:ascii="Times New Roman" w:eastAsia="Times New Roman" w:hAnsi="Times New Roman" w:cs="Times New Roman"/>
+          <w:sz w:val="24"/>
+          <w:szCs w:val="24"/>
+          <w:lang w:eastAsia="es-VE"/>
+        </w:rPr>
+        <w:pict>
+          <v:rect id="_x0000_i1032" style="width:0;height:1.5pt" o:hralign="center" o:hrstd="t" o:hr="t" fillcolor="#a0a0a0" stroked="f"/>
+        </w:pict>
+      </w:r>
+    </w:p>
+    <w:p>
+      <w:pPr>
+        <w:spacing w:before="100" w:beforeAutospacing="1" w:after="100" w:afterAutospacing="1" w:line="240" w:lineRule="auto"/>
+        <w:outlineLvl w:val="2"/>
+        <w:rPr>
+          <w:rFonts w:ascii="Times New Roman" w:eastAsia="Times New Roman" w:hAnsi="Times New Roman" w:cs="Times New Roman"/>
+          <w:b/>
+          <w:bCs/>
+          <w:sz w:val="27"/>
+          <w:szCs w:val="27"/>
+          <w:lang w:eastAsia="es-VE"/>
+        </w:rPr>
+      </w:pPr>
+      <w:r>
+        <w:rPr>
+          <w:rFonts w:ascii="Times New Roman" w:eastAsia="Times New Roman" w:hAnsi="Times New Roman" w:cs="Times New Roman"/>
+          <w:b/>
+          <w:bCs/>
+          <w:sz w:val="27"/>
+          <w:szCs w:val="27"/>
+          <w:lang w:eastAsia="es-VE"/>
+        </w:rPr>
+        <w:t>Punto 8 — ¿Qué tipo de tag se usa para píxeles de Facebook y Google Ads?</w:t>
+      </w:r>
+    </w:p>
+    <w:p>
+      <w:pPr>
+        <w:numPr>
+          <w:ilvl w:val="0"/>
+          <w:numId w:val="15"/>
+        </w:numPr>
+        <w:spacing w:before="100" w:beforeAutospacing="1" w:after="100" w:afterAutospacing="1" w:line="240" w:lineRule="auto"/>
+        <w:rPr>
+          <w:rFonts w:ascii="Times New Roman" w:eastAsia="Times New Roman" w:hAnsi="Times New Roman" w:cs="Times New Roman"/>
+          <w:sz w:val="24"/>
+          <w:szCs w:val="24"/>
+          <w:lang w:eastAsia="es-VE"/>
+        </w:rPr>
+      </w:pPr>
+      <w:r>
+        <w:rPr>
+          <w:rFonts w:ascii="Times New Roman" w:eastAsia="Times New Roman" w:hAnsi="Times New Roman" w:cs="Times New Roman"/>
+          <w:b/>
+          <w:bCs/>
+          <w:sz w:val="24"/>
+          <w:szCs w:val="24"/>
+          <w:lang w:eastAsia="es-VE"/>
+        </w:rPr>
+        <w:t>Facebook/Meta Pixel:</w:t>
+      </w:r>
+      <w:r>
+        <w:rPr>
+          <w:rFonts w:ascii="Times New Roman" w:eastAsia="Times New Roman" w:hAnsi="Times New Roman" w:cs="Times New Roman"/>
+          <w:sz w:val="24"/>
+          <w:szCs w:val="24"/>
+          <w:lang w:eastAsia="es-VE"/>
+        </w:rPr>
+        <w:t xml:space="preserve"> se implementa con una etiqueta de tipo </w:t>
+      </w:r>
+      <w:r>
+        <w:rPr>
+          <w:rFonts w:ascii="Times New Roman" w:eastAsia="Times New Roman" w:hAnsi="Times New Roman" w:cs="Times New Roman"/>
+          <w:bCs/>
+          <w:sz w:val="24"/>
+          <w:szCs w:val="24"/>
+          <w:lang w:eastAsia="es-VE"/>
+        </w:rPr>
+        <w:t>HTML personalizado</w:t>
+      </w:r>
+      <w:r>
+        <w:rPr>
+          <w:rFonts w:ascii="Times New Roman" w:eastAsia="Times New Roman" w:hAnsi="Times New Roman" w:cs="Times New Roman"/>
+          <w:sz w:val="24"/>
+          <w:szCs w:val="24"/>
+          <w:lang w:eastAsia="es-VE"/>
+        </w:rPr>
+        <w:t>, pegando el código base del píxel que entrega Meta Business Manager.</w:t>
+      </w:r>
+    </w:p>
+    <w:p>
+      <w:pPr>
+        <w:numPr>
+          <w:ilvl w:val="0"/>
+          <w:numId w:val="15"/>
+        </w:numPr>
+        <w:spacing w:before="100" w:beforeAutospacing="1" w:after="100" w:afterAutospacing="1" w:line="240" w:lineRule="auto"/>
+        <w:rPr>
+          <w:rFonts w:ascii="Times New Roman" w:eastAsia="Times New Roman" w:hAnsi="Times New Roman" w:cs="Times New Roman"/>
+          <w:sz w:val="24"/>
+          <w:szCs w:val="24"/>
+          <w:lang w:eastAsia="es-VE"/>
+        </w:rPr>
+      </w:pPr>
+      <w:r>
+        <w:rPr>
+          <w:rFonts w:ascii="Times New Roman" w:eastAsia="Times New Roman" w:hAnsi="Times New Roman" w:cs="Times New Roman"/>
+          <w:b/>
+          <w:bCs/>
+          <w:sz w:val="24"/>
+          <w:szCs w:val="24"/>
+          <w:lang w:eastAsia="es-VE"/>
+        </w:rPr>
+        <w:t>Google Ads:</w:t>
+      </w:r>
+      <w:r>
+        <w:rPr>
+          <w:rFonts w:ascii="Times New Roman" w:eastAsia="Times New Roman" w:hAnsi="Times New Roman" w:cs="Times New Roman"/>
+          <w:sz w:val="24"/>
+          <w:szCs w:val="24"/>
+          <w:lang w:eastAsia="es-VE"/>
+        </w:rPr>
+        <w:t xml:space="preserve"> se implementa con la etiqueta nativa </w:t>
+      </w:r>
+      <w:r>
+        <w:rPr>
+          <w:rFonts w:ascii="Times New Roman" w:eastAsia="Times New Roman" w:hAnsi="Times New Roman" w:cs="Times New Roman"/>
+          <w:bCs/>
+          <w:sz w:val="24"/>
+          <w:szCs w:val="24"/>
+          <w:lang w:eastAsia="es-VE"/>
+        </w:rPr>
+        <w:t>Etiqueta de Google</w:t>
+      </w:r>
+      <w:r>
+        <w:rPr>
+          <w:rFonts w:ascii="Times New Roman" w:eastAsia="Times New Roman" w:hAnsi="Times New Roman" w:cs="Times New Roman"/>
+          <w:sz w:val="24"/>
+          <w:szCs w:val="24"/>
+          <w:lang w:eastAsia="es-VE"/>
+        </w:rPr>
+        <w:t xml:space="preserve"> usando el ID de conversión (</w:t>
+      </w:r>
+      <w:r>
+        <w:rPr>
+          <w:rFonts w:ascii="Courier New" w:eastAsia="Times New Roman" w:hAnsi="Courier New" w:cs="Courier New"/>
+          <w:sz w:val="20"/>
+          <w:szCs w:val="20"/>
+          <w:lang w:eastAsia="es-VE"/>
+        </w:rPr>
+        <w:t>AW-XXXXXXXXX</w:t>
+      </w:r>
+      <w:r>
+        <w:rPr>
+          <w:rFonts w:ascii="Times New Roman" w:eastAsia="Times New Roman" w:hAnsi="Times New Roman" w:cs="Times New Roman"/>
+          <w:sz w:val="24"/>
+          <w:szCs w:val="24"/>
+          <w:lang w:eastAsia="es-VE"/>
+        </w:rPr>
+        <w:t xml:space="preserve">), o con </w:t>
+      </w:r>
+      <w:r>
+        <w:rPr>
+          <w:rFonts w:ascii="Times New Roman" w:eastAsia="Times New Roman" w:hAnsi="Times New Roman" w:cs="Times New Roman"/>
+          <w:bCs/>
+          <w:sz w:val="24"/>
+          <w:szCs w:val="24"/>
+          <w:lang w:eastAsia="es-VE"/>
+        </w:rPr>
+        <w:t>HTML personalizado</w:t>
+      </w:r>
+      <w:r>
+        <w:rPr>
+          <w:rFonts w:ascii="Times New Roman" w:eastAsia="Times New Roman" w:hAnsi="Times New Roman" w:cs="Times New Roman"/>
+          <w:sz w:val="24"/>
+          <w:szCs w:val="24"/>
+          <w:lang w:eastAsia="es-VE"/>
+        </w:rPr>
+        <w:t xml:space="preserve"> para casos más específicos como remarketing.</w:t>
+      </w:r>
       <w:bookmarkStart w:id="0" w:name="_GoBack"/>
       <w:bookmarkEnd w:id="0"/>
     </w:p>
     <w:p>
       <w:pPr>
-        <w:rPr>
-          <w:b/>
+        <w:spacing w:before="100" w:beforeAutospacing="1" w:after="100" w:afterAutospacing="1" w:line="240" w:lineRule="auto"/>
+        <w:rPr>
+          <w:rFonts w:ascii="Times New Roman" w:eastAsia="Times New Roman" w:hAnsi="Times New Roman" w:cs="Times New Roman"/>
+          <w:sz w:val="24"/>
+          <w:szCs w:val="24"/>
+          <w:lang w:eastAsia="es-VE"/>
+        </w:rPr>
+      </w:pPr>
+      <w:r>
+        <w:rPr>
+          <w:rFonts w:ascii="Times New Roman" w:eastAsia="Times New Roman" w:hAnsi="Times New Roman" w:cs="Times New Roman"/>
+          <w:sz w:val="24"/>
+          <w:szCs w:val="24"/>
+          <w:lang w:eastAsia="es-VE"/>
+        </w:rPr>
+        <w:t>En ambos casos GTM permite centralizar la gestión sin tocar el código del sitio directamente.</w:t>
+      </w:r>
+    </w:p>
+    <w:p>
+      <w:pPr>
+        <w:jc w:val="center"/>
+        <w:rPr>
           <w:lang w:val="es-ES"/>
         </w:rPr>
       </w:pPr>
+      <w:r>
+        <w:rPr>
+          <w:rFonts w:ascii="Times New Roman" w:eastAsia="Times New Roman" w:hAnsi="Times New Roman" w:cs="Times New Roman"/>
+          <w:sz w:val="24"/>
+          <w:szCs w:val="24"/>
+          <w:lang w:eastAsia="es-VE"/>
+        </w:rPr>
+        <w:pict>
+          <v:rect id="_x0000_i1033" style="width:0;height:1.5pt" o:hralign="center" o:hrstd="t" o:hr="t" fillcolor="#a0a0a0" stroked="f"/>
+        </w:pict>
+      </w:r>
+    </w:p>
+    <w:p>
+      <w:pPr>
+        <w:pStyle w:val="Ttulo3"/>
+      </w:pPr>
+      <w:r>
+        <w:t>Punto 9 — ¿Cuándo usar cada tipo de activador?</w:t>
+      </w:r>
+    </w:p>
+    <w:p>
+      <w:pPr>
+        <w:pStyle w:val="font-claude-response-body"/>
+      </w:pPr>
+      <w:r>
+        <w:rPr>
+          <w:rStyle w:val="Textoennegrita"/>
+        </w:rPr>
+        <w:t>Cambios en el historial</w:t>
+      </w:r>
+      <w:r>
+        <w:t xml:space="preserve"> Se usa en sitios de una sola página (SPA) como React o Angular, donde la URL cambia sin recargar la página. GTM no detecta esas navegaciones con el activador de página vista estándar, por lo que se usa este activador para registrar cada cambio de vista como si fuera una página nueva.</w:t>
+      </w:r>
+    </w:p>
+    <w:p>
+      <w:pPr>
+        <w:pStyle w:val="font-claude-response-body"/>
+      </w:pPr>
+      <w:r>
+        <w:rPr>
+          <w:rStyle w:val="Textoennegrita"/>
+        </w:rPr>
+        <w:t>Visibilidad de elemento</w:t>
+      </w:r>
+      <w:r>
+        <w:t xml:space="preserve"> Se usa cuando se quiere disparar un evento cuando el usuario ve un elemento específico en pantalla, por ejemplo: un banner, una sección de precios o un botón de CTA. Útil para medir engagement sin necesidad de un clic.</w:t>
+      </w:r>
+    </w:p>
+    <w:p>
+      <w:pPr>
+        <w:pStyle w:val="font-claude-response-body"/>
+      </w:pPr>
+      <w:r>
+        <w:rPr>
+          <w:rStyle w:val="Textoennegrita"/>
+        </w:rPr>
+        <w:t>Evento personalizado</w:t>
+      </w:r>
+      <w:r>
+        <w:t xml:space="preserve"> Se usa cuando el sitio envía un evento específico al </w:t>
+      </w:r>
+      <w:r>
+        <w:rPr>
+          <w:rStyle w:val="CdigoHTML"/>
+        </w:rPr>
+        <w:t>dataLayer</w:t>
+      </w:r>
+      <w:r>
+        <w:t xml:space="preserve"> mediante </w:t>
+      </w:r>
+      <w:r>
+        <w:rPr>
+          <w:rStyle w:val="CdigoHTML"/>
+        </w:rPr>
+        <w:t>dataLayer.push({ 'event': 'nombre_evento' })</w:t>
+      </w:r>
+      <w:r>
+        <w:t>. GTM escucha ese nombre y dispara la etiqueta correspondiente. Es el activador más flexible y preciso para flujos de negocio personalizados.</w:t>
+      </w:r>
     </w:p>
     <w:sectPr>
       <w:pgSz w:w="12240" w:h="15840"/>
@@ -8934,9 +12104,9 @@
     </w:lvl>
   </w:abstractNum>
   <w:abstractNum w:abstractNumId="2">
-    <w:nsid w:val="27F17CB2"/>
+    <w:nsid w:val="134163D1"/>
     <w:multiLevelType w:val="multilevel"/>
-    <w:tmpl w:val="2BE0A6E0"/>
+    <w:tmpl w:val="4AB43E5C"/>
     <w:lvl w:ilvl="0">
       <w:start w:val="1"/>
       <w:numFmt w:val="bullet"/>
@@ -9083,9 +12253,9 @@
     </w:lvl>
   </w:abstractNum>
   <w:abstractNum w:abstractNumId="3">
-    <w:nsid w:val="30C11E68"/>
+    <w:nsid w:val="1A166E02"/>
     <w:multiLevelType w:val="multilevel"/>
-    <w:tmpl w:val="5A9C6F58"/>
+    <w:tmpl w:val="029ECB52"/>
     <w:lvl w:ilvl="0">
       <w:start w:val="1"/>
       <w:numFmt w:val="bullet"/>
@@ -9232,9 +12402,9 @@
     </w:lvl>
   </w:abstractNum>
   <w:abstractNum w:abstractNumId="4">
-    <w:nsid w:val="38FD7448"/>
+    <w:nsid w:val="1B635470"/>
     <w:multiLevelType w:val="multilevel"/>
-    <w:tmpl w:val="92B228FE"/>
+    <w:tmpl w:val="21D8CB98"/>
     <w:lvl w:ilvl="0">
       <w:start w:val="1"/>
       <w:numFmt w:val="bullet"/>
@@ -9381,9 +12551,9 @@
     </w:lvl>
   </w:abstractNum>
   <w:abstractNum w:abstractNumId="5">
-    <w:nsid w:val="4AA72F07"/>
+    <w:nsid w:val="1DFF79E6"/>
     <w:multiLevelType w:val="multilevel"/>
-    <w:tmpl w:val="BE16F0A4"/>
+    <w:tmpl w:val="9988A34E"/>
     <w:lvl w:ilvl="0">
       <w:start w:val="1"/>
       <w:numFmt w:val="bullet"/>
@@ -9530,9 +12700,9 @@
     </w:lvl>
   </w:abstractNum>
   <w:abstractNum w:abstractNumId="6">
-    <w:nsid w:val="724E6BA6"/>
+    <w:nsid w:val="27F17CB2"/>
     <w:multiLevelType w:val="multilevel"/>
-    <w:tmpl w:val="3084A9AC"/>
+    <w:tmpl w:val="2BE0A6E0"/>
     <w:lvl w:ilvl="0">
       <w:start w:val="1"/>
       <w:numFmt w:val="bullet"/>
@@ -9678,26 +12848,1242 @@
       </w:rPr>
     </w:lvl>
   </w:abstractNum>
+  <w:abstractNum w:abstractNumId="7">
+    <w:nsid w:val="2C4B6F24"/>
+    <w:multiLevelType w:val="multilevel"/>
+    <w:tmpl w:val="ED0ED9C0"/>
+    <w:lvl w:ilvl="0">
+      <w:start w:val="1"/>
+      <w:numFmt w:val="bullet"/>
+      <w:lvlText w:val=""/>
+      <w:lvlJc w:val="left"/>
+      <w:pPr>
+        <w:tabs>
+          <w:tab w:val="num" w:pos="720"/>
+        </w:tabs>
+        <w:ind w:left="720" w:hanging="360"/>
+      </w:pPr>
+      <w:rPr>
+        <w:rFonts w:ascii="Symbol" w:hAnsi="Symbol" w:hint="default"/>
+        <w:sz w:val="20"/>
+      </w:rPr>
+    </w:lvl>
+    <w:lvl w:ilvl="1" w:tentative="1">
+      <w:start w:val="1"/>
+      <w:numFmt w:val="bullet"/>
+      <w:lvlText w:val="o"/>
+      <w:lvlJc w:val="left"/>
+      <w:pPr>
+        <w:tabs>
+          <w:tab w:val="num" w:pos="1440"/>
+        </w:tabs>
+        <w:ind w:left="1440" w:hanging="360"/>
+      </w:pPr>
+      <w:rPr>
+        <w:rFonts w:ascii="Courier New" w:hAnsi="Courier New" w:hint="default"/>
+        <w:sz w:val="20"/>
+      </w:rPr>
+    </w:lvl>
+    <w:lvl w:ilvl="2" w:tentative="1">
+      <w:start w:val="1"/>
+      <w:numFmt w:val="bullet"/>
+      <w:lvlText w:val=""/>
+      <w:lvlJc w:val="left"/>
+      <w:pPr>
+        <w:tabs>
+          <w:tab w:val="num" w:pos="2160"/>
+        </w:tabs>
+        <w:ind w:left="2160" w:hanging="360"/>
+      </w:pPr>
+      <w:rPr>
+        <w:rFonts w:ascii="Wingdings" w:hAnsi="Wingdings" w:hint="default"/>
+        <w:sz w:val="20"/>
+      </w:rPr>
+    </w:lvl>
+    <w:lvl w:ilvl="3" w:tentative="1">
+      <w:start w:val="1"/>
+      <w:numFmt w:val="bullet"/>
+      <w:lvlText w:val=""/>
+      <w:lvlJc w:val="left"/>
+      <w:pPr>
+        <w:tabs>
+          <w:tab w:val="num" w:pos="2880"/>
+        </w:tabs>
+        <w:ind w:left="2880" w:hanging="360"/>
+      </w:pPr>
+      <w:rPr>
+        <w:rFonts w:ascii="Wingdings" w:hAnsi="Wingdings" w:hint="default"/>
+        <w:sz w:val="20"/>
+      </w:rPr>
+    </w:lvl>
+    <w:lvl w:ilvl="4" w:tentative="1">
+      <w:start w:val="1"/>
+      <w:numFmt w:val="bullet"/>
+      <w:lvlText w:val=""/>
+      <w:lvlJc w:val="left"/>
+      <w:pPr>
+        <w:tabs>
+          <w:tab w:val="num" w:pos="3600"/>
+        </w:tabs>
+        <w:ind w:left="3600" w:hanging="360"/>
+      </w:pPr>
+      <w:rPr>
+        <w:rFonts w:ascii="Wingdings" w:hAnsi="Wingdings" w:hint="default"/>
+        <w:sz w:val="20"/>
+      </w:rPr>
+    </w:lvl>
+    <w:lvl w:ilvl="5" w:tentative="1">
+      <w:start w:val="1"/>
+      <w:numFmt w:val="bullet"/>
+      <w:lvlText w:val=""/>
+      <w:lvlJc w:val="left"/>
+      <w:pPr>
+        <w:tabs>
+          <w:tab w:val="num" w:pos="4320"/>
+        </w:tabs>
+        <w:ind w:left="4320" w:hanging="360"/>
+      </w:pPr>
+      <w:rPr>
+        <w:rFonts w:ascii="Wingdings" w:hAnsi="Wingdings" w:hint="default"/>
+        <w:sz w:val="20"/>
+      </w:rPr>
+    </w:lvl>
+    <w:lvl w:ilvl="6" w:tentative="1">
+      <w:start w:val="1"/>
+      <w:numFmt w:val="bullet"/>
+      <w:lvlText w:val=""/>
+      <w:lvlJc w:val="left"/>
+      <w:pPr>
+        <w:tabs>
+          <w:tab w:val="num" w:pos="5040"/>
+        </w:tabs>
+        <w:ind w:left="5040" w:hanging="360"/>
+      </w:pPr>
+      <w:rPr>
+        <w:rFonts w:ascii="Wingdings" w:hAnsi="Wingdings" w:hint="default"/>
+        <w:sz w:val="20"/>
+      </w:rPr>
+    </w:lvl>
+    <w:lvl w:ilvl="7" w:tentative="1">
+      <w:start w:val="1"/>
+      <w:numFmt w:val="bullet"/>
+      <w:lvlText w:val=""/>
+      <w:lvlJc w:val="left"/>
+      <w:pPr>
+        <w:tabs>
+          <w:tab w:val="num" w:pos="5760"/>
+        </w:tabs>
+        <w:ind w:left="5760" w:hanging="360"/>
+      </w:pPr>
+      <w:rPr>
+        <w:rFonts w:ascii="Wingdings" w:hAnsi="Wingdings" w:hint="default"/>
+        <w:sz w:val="20"/>
+      </w:rPr>
+    </w:lvl>
+    <w:lvl w:ilvl="8" w:tentative="1">
+      <w:start w:val="1"/>
+      <w:numFmt w:val="bullet"/>
+      <w:lvlText w:val=""/>
+      <w:lvlJc w:val="left"/>
+      <w:pPr>
+        <w:tabs>
+          <w:tab w:val="num" w:pos="6480"/>
+        </w:tabs>
+        <w:ind w:left="6480" w:hanging="360"/>
+      </w:pPr>
+      <w:rPr>
+        <w:rFonts w:ascii="Wingdings" w:hAnsi="Wingdings" w:hint="default"/>
+        <w:sz w:val="20"/>
+      </w:rPr>
+    </w:lvl>
+  </w:abstractNum>
+  <w:abstractNum w:abstractNumId="8">
+    <w:nsid w:val="30C11E68"/>
+    <w:multiLevelType w:val="multilevel"/>
+    <w:tmpl w:val="5A9C6F58"/>
+    <w:lvl w:ilvl="0">
+      <w:start w:val="1"/>
+      <w:numFmt w:val="bullet"/>
+      <w:lvlText w:val=""/>
+      <w:lvlJc w:val="left"/>
+      <w:pPr>
+        <w:tabs>
+          <w:tab w:val="num" w:pos="720"/>
+        </w:tabs>
+        <w:ind w:left="720" w:hanging="360"/>
+      </w:pPr>
+      <w:rPr>
+        <w:rFonts w:ascii="Symbol" w:hAnsi="Symbol" w:hint="default"/>
+        <w:sz w:val="20"/>
+      </w:rPr>
+    </w:lvl>
+    <w:lvl w:ilvl="1" w:tentative="1">
+      <w:start w:val="1"/>
+      <w:numFmt w:val="bullet"/>
+      <w:lvlText w:val="o"/>
+      <w:lvlJc w:val="left"/>
+      <w:pPr>
+        <w:tabs>
+          <w:tab w:val="num" w:pos="1440"/>
+        </w:tabs>
+        <w:ind w:left="1440" w:hanging="360"/>
+      </w:pPr>
+      <w:rPr>
+        <w:rFonts w:ascii="Courier New" w:hAnsi="Courier New" w:hint="default"/>
+        <w:sz w:val="20"/>
+      </w:rPr>
+    </w:lvl>
+    <w:lvl w:ilvl="2" w:tentative="1">
+      <w:start w:val="1"/>
+      <w:numFmt w:val="bullet"/>
+      <w:lvlText w:val=""/>
+      <w:lvlJc w:val="left"/>
+      <w:pPr>
+        <w:tabs>
+          <w:tab w:val="num" w:pos="2160"/>
+        </w:tabs>
+        <w:ind w:left="2160" w:hanging="360"/>
+      </w:pPr>
+      <w:rPr>
+        <w:rFonts w:ascii="Wingdings" w:hAnsi="Wingdings" w:hint="default"/>
+        <w:sz w:val="20"/>
+      </w:rPr>
+    </w:lvl>
+    <w:lvl w:ilvl="3" w:tentative="1">
+      <w:start w:val="1"/>
+      <w:numFmt w:val="bullet"/>
+      <w:lvlText w:val=""/>
+      <w:lvlJc w:val="left"/>
+      <w:pPr>
+        <w:tabs>
+          <w:tab w:val="num" w:pos="2880"/>
+        </w:tabs>
+        <w:ind w:left="2880" w:hanging="360"/>
+      </w:pPr>
+      <w:rPr>
+        <w:rFonts w:ascii="Wingdings" w:hAnsi="Wingdings" w:hint="default"/>
+        <w:sz w:val="20"/>
+      </w:rPr>
+    </w:lvl>
+    <w:lvl w:ilvl="4" w:tentative="1">
+      <w:start w:val="1"/>
+      <w:numFmt w:val="bullet"/>
+      <w:lvlText w:val=""/>
+      <w:lvlJc w:val="left"/>
+      <w:pPr>
+        <w:tabs>
+          <w:tab w:val="num" w:pos="3600"/>
+        </w:tabs>
+        <w:ind w:left="3600" w:hanging="360"/>
+      </w:pPr>
+      <w:rPr>
+        <w:rFonts w:ascii="Wingdings" w:hAnsi="Wingdings" w:hint="default"/>
+        <w:sz w:val="20"/>
+      </w:rPr>
+    </w:lvl>
+    <w:lvl w:ilvl="5" w:tentative="1">
+      <w:start w:val="1"/>
+      <w:numFmt w:val="bullet"/>
+      <w:lvlText w:val=""/>
+      <w:lvlJc w:val="left"/>
+      <w:pPr>
+        <w:tabs>
+          <w:tab w:val="num" w:pos="4320"/>
+        </w:tabs>
+        <w:ind w:left="4320" w:hanging="360"/>
+      </w:pPr>
+      <w:rPr>
+        <w:rFonts w:ascii="Wingdings" w:hAnsi="Wingdings" w:hint="default"/>
+        <w:sz w:val="20"/>
+      </w:rPr>
+    </w:lvl>
+    <w:lvl w:ilvl="6" w:tentative="1">
+      <w:start w:val="1"/>
+      <w:numFmt w:val="bullet"/>
+      <w:lvlText w:val=""/>
+      <w:lvlJc w:val="left"/>
+      <w:pPr>
+        <w:tabs>
+          <w:tab w:val="num" w:pos="5040"/>
+        </w:tabs>
+        <w:ind w:left="5040" w:hanging="360"/>
+      </w:pPr>
+      <w:rPr>
+        <w:rFonts w:ascii="Wingdings" w:hAnsi="Wingdings" w:hint="default"/>
+        <w:sz w:val="20"/>
+      </w:rPr>
+    </w:lvl>
+    <w:lvl w:ilvl="7" w:tentative="1">
+      <w:start w:val="1"/>
+      <w:numFmt w:val="bullet"/>
+      <w:lvlText w:val=""/>
+      <w:lvlJc w:val="left"/>
+      <w:pPr>
+        <w:tabs>
+          <w:tab w:val="num" w:pos="5760"/>
+        </w:tabs>
+        <w:ind w:left="5760" w:hanging="360"/>
+      </w:pPr>
+      <w:rPr>
+        <w:rFonts w:ascii="Wingdings" w:hAnsi="Wingdings" w:hint="default"/>
+        <w:sz w:val="20"/>
+      </w:rPr>
+    </w:lvl>
+    <w:lvl w:ilvl="8" w:tentative="1">
+      <w:start w:val="1"/>
+      <w:numFmt w:val="bullet"/>
+      <w:lvlText w:val=""/>
+      <w:lvlJc w:val="left"/>
+      <w:pPr>
+        <w:tabs>
+          <w:tab w:val="num" w:pos="6480"/>
+        </w:tabs>
+        <w:ind w:left="6480" w:hanging="360"/>
+      </w:pPr>
+      <w:rPr>
+        <w:rFonts w:ascii="Wingdings" w:hAnsi="Wingdings" w:hint="default"/>
+        <w:sz w:val="20"/>
+      </w:rPr>
+    </w:lvl>
+  </w:abstractNum>
+  <w:abstractNum w:abstractNumId="9">
+    <w:nsid w:val="38FD7448"/>
+    <w:multiLevelType w:val="multilevel"/>
+    <w:tmpl w:val="92B228FE"/>
+    <w:lvl w:ilvl="0">
+      <w:start w:val="1"/>
+      <w:numFmt w:val="bullet"/>
+      <w:lvlText w:val=""/>
+      <w:lvlJc w:val="left"/>
+      <w:pPr>
+        <w:tabs>
+          <w:tab w:val="num" w:pos="720"/>
+        </w:tabs>
+        <w:ind w:left="720" w:hanging="360"/>
+      </w:pPr>
+      <w:rPr>
+        <w:rFonts w:ascii="Symbol" w:hAnsi="Symbol" w:hint="default"/>
+        <w:sz w:val="20"/>
+      </w:rPr>
+    </w:lvl>
+    <w:lvl w:ilvl="1" w:tentative="1">
+      <w:start w:val="1"/>
+      <w:numFmt w:val="bullet"/>
+      <w:lvlText w:val="o"/>
+      <w:lvlJc w:val="left"/>
+      <w:pPr>
+        <w:tabs>
+          <w:tab w:val="num" w:pos="1440"/>
+        </w:tabs>
+        <w:ind w:left="1440" w:hanging="360"/>
+      </w:pPr>
+      <w:rPr>
+        <w:rFonts w:ascii="Courier New" w:hAnsi="Courier New" w:hint="default"/>
+        <w:sz w:val="20"/>
+      </w:rPr>
+    </w:lvl>
+    <w:lvl w:ilvl="2" w:tentative="1">
+      <w:start w:val="1"/>
+      <w:numFmt w:val="bullet"/>
+      <w:lvlText w:val=""/>
+      <w:lvlJc w:val="left"/>
+      <w:pPr>
+        <w:tabs>
+          <w:tab w:val="num" w:pos="2160"/>
+        </w:tabs>
+        <w:ind w:left="2160" w:hanging="360"/>
+      </w:pPr>
+      <w:rPr>
+        <w:rFonts w:ascii="Wingdings" w:hAnsi="Wingdings" w:hint="default"/>
+        <w:sz w:val="20"/>
+      </w:rPr>
+    </w:lvl>
+    <w:lvl w:ilvl="3" w:tentative="1">
+      <w:start w:val="1"/>
+      <w:numFmt w:val="bullet"/>
+      <w:lvlText w:val=""/>
+      <w:lvlJc w:val="left"/>
+      <w:pPr>
+        <w:tabs>
+          <w:tab w:val="num" w:pos="2880"/>
+        </w:tabs>
+        <w:ind w:left="2880" w:hanging="360"/>
+      </w:pPr>
+      <w:rPr>
+        <w:rFonts w:ascii="Wingdings" w:hAnsi="Wingdings" w:hint="default"/>
+        <w:sz w:val="20"/>
+      </w:rPr>
+    </w:lvl>
+    <w:lvl w:ilvl="4" w:tentative="1">
+      <w:start w:val="1"/>
+      <w:numFmt w:val="bullet"/>
+      <w:lvlText w:val=""/>
+      <w:lvlJc w:val="left"/>
+      <w:pPr>
+        <w:tabs>
+          <w:tab w:val="num" w:pos="3600"/>
+        </w:tabs>
+        <w:ind w:left="3600" w:hanging="360"/>
+      </w:pPr>
+      <w:rPr>
+        <w:rFonts w:ascii="Wingdings" w:hAnsi="Wingdings" w:hint="default"/>
+        <w:sz w:val="20"/>
+      </w:rPr>
+    </w:lvl>
+    <w:lvl w:ilvl="5" w:tentative="1">
+      <w:start w:val="1"/>
+      <w:numFmt w:val="bullet"/>
+      <w:lvlText w:val=""/>
+      <w:lvlJc w:val="left"/>
+      <w:pPr>
+        <w:tabs>
+          <w:tab w:val="num" w:pos="4320"/>
+        </w:tabs>
+        <w:ind w:left="4320" w:hanging="360"/>
+      </w:pPr>
+      <w:rPr>
+        <w:rFonts w:ascii="Wingdings" w:hAnsi="Wingdings" w:hint="default"/>
+        <w:sz w:val="20"/>
+      </w:rPr>
+    </w:lvl>
+    <w:lvl w:ilvl="6" w:tentative="1">
+      <w:start w:val="1"/>
+      <w:numFmt w:val="bullet"/>
+      <w:lvlText w:val=""/>
+      <w:lvlJc w:val="left"/>
+      <w:pPr>
+        <w:tabs>
+          <w:tab w:val="num" w:pos="5040"/>
+        </w:tabs>
+        <w:ind w:left="5040" w:hanging="360"/>
+      </w:pPr>
+      <w:rPr>
+        <w:rFonts w:ascii="Wingdings" w:hAnsi="Wingdings" w:hint="default"/>
+        <w:sz w:val="20"/>
+      </w:rPr>
+    </w:lvl>
+    <w:lvl w:ilvl="7" w:tentative="1">
+      <w:start w:val="1"/>
+      <w:numFmt w:val="bullet"/>
+      <w:lvlText w:val=""/>
+      <w:lvlJc w:val="left"/>
+      <w:pPr>
+        <w:tabs>
+          <w:tab w:val="num" w:pos="5760"/>
+        </w:tabs>
+        <w:ind w:left="5760" w:hanging="360"/>
+      </w:pPr>
+      <w:rPr>
+        <w:rFonts w:ascii="Wingdings" w:hAnsi="Wingdings" w:hint="default"/>
+        <w:sz w:val="20"/>
+      </w:rPr>
+    </w:lvl>
+    <w:lvl w:ilvl="8" w:tentative="1">
+      <w:start w:val="1"/>
+      <w:numFmt w:val="bullet"/>
+      <w:lvlText w:val=""/>
+      <w:lvlJc w:val="left"/>
+      <w:pPr>
+        <w:tabs>
+          <w:tab w:val="num" w:pos="6480"/>
+        </w:tabs>
+        <w:ind w:left="6480" w:hanging="360"/>
+      </w:pPr>
+      <w:rPr>
+        <w:rFonts w:ascii="Wingdings" w:hAnsi="Wingdings" w:hint="default"/>
+        <w:sz w:val="20"/>
+      </w:rPr>
+    </w:lvl>
+  </w:abstractNum>
+  <w:abstractNum w:abstractNumId="10">
+    <w:nsid w:val="4AA72F07"/>
+    <w:multiLevelType w:val="multilevel"/>
+    <w:tmpl w:val="BE16F0A4"/>
+    <w:lvl w:ilvl="0">
+      <w:start w:val="1"/>
+      <w:numFmt w:val="bullet"/>
+      <w:lvlText w:val=""/>
+      <w:lvlJc w:val="left"/>
+      <w:pPr>
+        <w:tabs>
+          <w:tab w:val="num" w:pos="720"/>
+        </w:tabs>
+        <w:ind w:left="720" w:hanging="360"/>
+      </w:pPr>
+      <w:rPr>
+        <w:rFonts w:ascii="Symbol" w:hAnsi="Symbol" w:hint="default"/>
+        <w:sz w:val="20"/>
+      </w:rPr>
+    </w:lvl>
+    <w:lvl w:ilvl="1" w:tentative="1">
+      <w:start w:val="1"/>
+      <w:numFmt w:val="bullet"/>
+      <w:lvlText w:val="o"/>
+      <w:lvlJc w:val="left"/>
+      <w:pPr>
+        <w:tabs>
+          <w:tab w:val="num" w:pos="1440"/>
+        </w:tabs>
+        <w:ind w:left="1440" w:hanging="360"/>
+      </w:pPr>
+      <w:rPr>
+        <w:rFonts w:ascii="Courier New" w:hAnsi="Courier New" w:hint="default"/>
+        <w:sz w:val="20"/>
+      </w:rPr>
+    </w:lvl>
+    <w:lvl w:ilvl="2" w:tentative="1">
+      <w:start w:val="1"/>
+      <w:numFmt w:val="bullet"/>
+      <w:lvlText w:val=""/>
+      <w:lvlJc w:val="left"/>
+      <w:pPr>
+        <w:tabs>
+          <w:tab w:val="num" w:pos="2160"/>
+        </w:tabs>
+        <w:ind w:left="2160" w:hanging="360"/>
+      </w:pPr>
+      <w:rPr>
+        <w:rFonts w:ascii="Wingdings" w:hAnsi="Wingdings" w:hint="default"/>
+        <w:sz w:val="20"/>
+      </w:rPr>
+    </w:lvl>
+    <w:lvl w:ilvl="3" w:tentative="1">
+      <w:start w:val="1"/>
+      <w:numFmt w:val="bullet"/>
+      <w:lvlText w:val=""/>
+      <w:lvlJc w:val="left"/>
+      <w:pPr>
+        <w:tabs>
+          <w:tab w:val="num" w:pos="2880"/>
+        </w:tabs>
+        <w:ind w:left="2880" w:hanging="360"/>
+      </w:pPr>
+      <w:rPr>
+        <w:rFonts w:ascii="Wingdings" w:hAnsi="Wingdings" w:hint="default"/>
+        <w:sz w:val="20"/>
+      </w:rPr>
+    </w:lvl>
+    <w:lvl w:ilvl="4" w:tentative="1">
+      <w:start w:val="1"/>
+      <w:numFmt w:val="bullet"/>
+      <w:lvlText w:val=""/>
+      <w:lvlJc w:val="left"/>
+      <w:pPr>
+        <w:tabs>
+          <w:tab w:val="num" w:pos="3600"/>
+        </w:tabs>
+        <w:ind w:left="3600" w:hanging="360"/>
+      </w:pPr>
+      <w:rPr>
+        <w:rFonts w:ascii="Wingdings" w:hAnsi="Wingdings" w:hint="default"/>
+        <w:sz w:val="20"/>
+      </w:rPr>
+    </w:lvl>
+    <w:lvl w:ilvl="5" w:tentative="1">
+      <w:start w:val="1"/>
+      <w:numFmt w:val="bullet"/>
+      <w:lvlText w:val=""/>
+      <w:lvlJc w:val="left"/>
+      <w:pPr>
+        <w:tabs>
+          <w:tab w:val="num" w:pos="4320"/>
+        </w:tabs>
+        <w:ind w:left="4320" w:hanging="360"/>
+      </w:pPr>
+      <w:rPr>
+        <w:rFonts w:ascii="Wingdings" w:hAnsi="Wingdings" w:hint="default"/>
+        <w:sz w:val="20"/>
+      </w:rPr>
+    </w:lvl>
+    <w:lvl w:ilvl="6" w:tentative="1">
+      <w:start w:val="1"/>
+      <w:numFmt w:val="bullet"/>
+      <w:lvlText w:val=""/>
+      <w:lvlJc w:val="left"/>
+      <w:pPr>
+        <w:tabs>
+          <w:tab w:val="num" w:pos="5040"/>
+        </w:tabs>
+        <w:ind w:left="5040" w:hanging="360"/>
+      </w:pPr>
+      <w:rPr>
+        <w:rFonts w:ascii="Wingdings" w:hAnsi="Wingdings" w:hint="default"/>
+        <w:sz w:val="20"/>
+      </w:rPr>
+    </w:lvl>
+    <w:lvl w:ilvl="7" w:tentative="1">
+      <w:start w:val="1"/>
+      <w:numFmt w:val="bullet"/>
+      <w:lvlText w:val=""/>
+      <w:lvlJc w:val="left"/>
+      <w:pPr>
+        <w:tabs>
+          <w:tab w:val="num" w:pos="5760"/>
+        </w:tabs>
+        <w:ind w:left="5760" w:hanging="360"/>
+      </w:pPr>
+      <w:rPr>
+        <w:rFonts w:ascii="Wingdings" w:hAnsi="Wingdings" w:hint="default"/>
+        <w:sz w:val="20"/>
+      </w:rPr>
+    </w:lvl>
+    <w:lvl w:ilvl="8" w:tentative="1">
+      <w:start w:val="1"/>
+      <w:numFmt w:val="bullet"/>
+      <w:lvlText w:val=""/>
+      <w:lvlJc w:val="left"/>
+      <w:pPr>
+        <w:tabs>
+          <w:tab w:val="num" w:pos="6480"/>
+        </w:tabs>
+        <w:ind w:left="6480" w:hanging="360"/>
+      </w:pPr>
+      <w:rPr>
+        <w:rFonts w:ascii="Wingdings" w:hAnsi="Wingdings" w:hint="default"/>
+        <w:sz w:val="20"/>
+      </w:rPr>
+    </w:lvl>
+  </w:abstractNum>
+  <w:abstractNum w:abstractNumId="11">
+    <w:nsid w:val="52A71A19"/>
+    <w:multiLevelType w:val="multilevel"/>
+    <w:tmpl w:val="CE98482E"/>
+    <w:lvl w:ilvl="0">
+      <w:start w:val="1"/>
+      <w:numFmt w:val="bullet"/>
+      <w:lvlText w:val=""/>
+      <w:lvlJc w:val="left"/>
+      <w:pPr>
+        <w:tabs>
+          <w:tab w:val="num" w:pos="720"/>
+        </w:tabs>
+        <w:ind w:left="720" w:hanging="360"/>
+      </w:pPr>
+      <w:rPr>
+        <w:rFonts w:ascii="Symbol" w:hAnsi="Symbol" w:hint="default"/>
+        <w:sz w:val="20"/>
+      </w:rPr>
+    </w:lvl>
+    <w:lvl w:ilvl="1" w:tentative="1">
+      <w:start w:val="1"/>
+      <w:numFmt w:val="bullet"/>
+      <w:lvlText w:val="o"/>
+      <w:lvlJc w:val="left"/>
+      <w:pPr>
+        <w:tabs>
+          <w:tab w:val="num" w:pos="1440"/>
+        </w:tabs>
+        <w:ind w:left="1440" w:hanging="360"/>
+      </w:pPr>
+      <w:rPr>
+        <w:rFonts w:ascii="Courier New" w:hAnsi="Courier New" w:hint="default"/>
+        <w:sz w:val="20"/>
+      </w:rPr>
+    </w:lvl>
+    <w:lvl w:ilvl="2" w:tentative="1">
+      <w:start w:val="1"/>
+      <w:numFmt w:val="bullet"/>
+      <w:lvlText w:val=""/>
+      <w:lvlJc w:val="left"/>
+      <w:pPr>
+        <w:tabs>
+          <w:tab w:val="num" w:pos="2160"/>
+        </w:tabs>
+        <w:ind w:left="2160" w:hanging="360"/>
+      </w:pPr>
+      <w:rPr>
+        <w:rFonts w:ascii="Wingdings" w:hAnsi="Wingdings" w:hint="default"/>
+        <w:sz w:val="20"/>
+      </w:rPr>
+    </w:lvl>
+    <w:lvl w:ilvl="3" w:tentative="1">
+      <w:start w:val="1"/>
+      <w:numFmt w:val="bullet"/>
+      <w:lvlText w:val=""/>
+      <w:lvlJc w:val="left"/>
+      <w:pPr>
+        <w:tabs>
+          <w:tab w:val="num" w:pos="2880"/>
+        </w:tabs>
+        <w:ind w:left="2880" w:hanging="360"/>
+      </w:pPr>
+      <w:rPr>
+        <w:rFonts w:ascii="Wingdings" w:hAnsi="Wingdings" w:hint="default"/>
+        <w:sz w:val="20"/>
+      </w:rPr>
+    </w:lvl>
+    <w:lvl w:ilvl="4" w:tentative="1">
+      <w:start w:val="1"/>
+      <w:numFmt w:val="bullet"/>
+      <w:lvlText w:val=""/>
+      <w:lvlJc w:val="left"/>
+      <w:pPr>
+        <w:tabs>
+          <w:tab w:val="num" w:pos="3600"/>
+        </w:tabs>
+        <w:ind w:left="3600" w:hanging="360"/>
+      </w:pPr>
+      <w:rPr>
+        <w:rFonts w:ascii="Wingdings" w:hAnsi="Wingdings" w:hint="default"/>
+        <w:sz w:val="20"/>
+      </w:rPr>
+    </w:lvl>
+    <w:lvl w:ilvl="5" w:tentative="1">
+      <w:start w:val="1"/>
+      <w:numFmt w:val="bullet"/>
+      <w:lvlText w:val=""/>
+      <w:lvlJc w:val="left"/>
+      <w:pPr>
+        <w:tabs>
+          <w:tab w:val="num" w:pos="4320"/>
+        </w:tabs>
+        <w:ind w:left="4320" w:hanging="360"/>
+      </w:pPr>
+      <w:rPr>
+        <w:rFonts w:ascii="Wingdings" w:hAnsi="Wingdings" w:hint="default"/>
+        <w:sz w:val="20"/>
+      </w:rPr>
+    </w:lvl>
+    <w:lvl w:ilvl="6" w:tentative="1">
+      <w:start w:val="1"/>
+      <w:numFmt w:val="bullet"/>
+      <w:lvlText w:val=""/>
+      <w:lvlJc w:val="left"/>
+      <w:pPr>
+        <w:tabs>
+          <w:tab w:val="num" w:pos="5040"/>
+        </w:tabs>
+        <w:ind w:left="5040" w:hanging="360"/>
+      </w:pPr>
+      <w:rPr>
+        <w:rFonts w:ascii="Wingdings" w:hAnsi="Wingdings" w:hint="default"/>
+        <w:sz w:val="20"/>
+      </w:rPr>
+    </w:lvl>
+    <w:lvl w:ilvl="7" w:tentative="1">
+      <w:start w:val="1"/>
+      <w:numFmt w:val="bullet"/>
+      <w:lvlText w:val=""/>
+      <w:lvlJc w:val="left"/>
+      <w:pPr>
+        <w:tabs>
+          <w:tab w:val="num" w:pos="5760"/>
+        </w:tabs>
+        <w:ind w:left="5760" w:hanging="360"/>
+      </w:pPr>
+      <w:rPr>
+        <w:rFonts w:ascii="Wingdings" w:hAnsi="Wingdings" w:hint="default"/>
+        <w:sz w:val="20"/>
+      </w:rPr>
+    </w:lvl>
+    <w:lvl w:ilvl="8" w:tentative="1">
+      <w:start w:val="1"/>
+      <w:numFmt w:val="bullet"/>
+      <w:lvlText w:val=""/>
+      <w:lvlJc w:val="left"/>
+      <w:pPr>
+        <w:tabs>
+          <w:tab w:val="num" w:pos="6480"/>
+        </w:tabs>
+        <w:ind w:left="6480" w:hanging="360"/>
+      </w:pPr>
+      <w:rPr>
+        <w:rFonts w:ascii="Wingdings" w:hAnsi="Wingdings" w:hint="default"/>
+        <w:sz w:val="20"/>
+      </w:rPr>
+    </w:lvl>
+  </w:abstractNum>
+  <w:abstractNum w:abstractNumId="12">
+    <w:nsid w:val="5B0F21D1"/>
+    <w:multiLevelType w:val="multilevel"/>
+    <w:tmpl w:val="13F62A4C"/>
+    <w:lvl w:ilvl="0">
+      <w:start w:val="1"/>
+      <w:numFmt w:val="bullet"/>
+      <w:lvlText w:val=""/>
+      <w:lvlJc w:val="left"/>
+      <w:pPr>
+        <w:tabs>
+          <w:tab w:val="num" w:pos="720"/>
+        </w:tabs>
+        <w:ind w:left="720" w:hanging="360"/>
+      </w:pPr>
+      <w:rPr>
+        <w:rFonts w:ascii="Symbol" w:hAnsi="Symbol" w:hint="default"/>
+        <w:sz w:val="20"/>
+      </w:rPr>
+    </w:lvl>
+    <w:lvl w:ilvl="1" w:tentative="1">
+      <w:start w:val="1"/>
+      <w:numFmt w:val="bullet"/>
+      <w:lvlText w:val="o"/>
+      <w:lvlJc w:val="left"/>
+      <w:pPr>
+        <w:tabs>
+          <w:tab w:val="num" w:pos="1440"/>
+        </w:tabs>
+        <w:ind w:left="1440" w:hanging="360"/>
+      </w:pPr>
+      <w:rPr>
+        <w:rFonts w:ascii="Courier New" w:hAnsi="Courier New" w:hint="default"/>
+        <w:sz w:val="20"/>
+      </w:rPr>
+    </w:lvl>
+    <w:lvl w:ilvl="2" w:tentative="1">
+      <w:start w:val="1"/>
+      <w:numFmt w:val="bullet"/>
+      <w:lvlText w:val=""/>
+      <w:lvlJc w:val="left"/>
+      <w:pPr>
+        <w:tabs>
+          <w:tab w:val="num" w:pos="2160"/>
+        </w:tabs>
+        <w:ind w:left="2160" w:hanging="360"/>
+      </w:pPr>
+      <w:rPr>
+        <w:rFonts w:ascii="Wingdings" w:hAnsi="Wingdings" w:hint="default"/>
+        <w:sz w:val="20"/>
+      </w:rPr>
+    </w:lvl>
+    <w:lvl w:ilvl="3" w:tentative="1">
+      <w:start w:val="1"/>
+      <w:numFmt w:val="bullet"/>
+      <w:lvlText w:val=""/>
+      <w:lvlJc w:val="left"/>
+      <w:pPr>
+        <w:tabs>
+          <w:tab w:val="num" w:pos="2880"/>
+        </w:tabs>
+        <w:ind w:left="2880" w:hanging="360"/>
+      </w:pPr>
+      <w:rPr>
+        <w:rFonts w:ascii="Wingdings" w:hAnsi="Wingdings" w:hint="default"/>
+        <w:sz w:val="20"/>
+      </w:rPr>
+    </w:lvl>
+    <w:lvl w:ilvl="4" w:tentative="1">
+      <w:start w:val="1"/>
+      <w:numFmt w:val="bullet"/>
+      <w:lvlText w:val=""/>
+      <w:lvlJc w:val="left"/>
+      <w:pPr>
+        <w:tabs>
+          <w:tab w:val="num" w:pos="3600"/>
+        </w:tabs>
+        <w:ind w:left="3600" w:hanging="360"/>
+      </w:pPr>
+      <w:rPr>
+        <w:rFonts w:ascii="Wingdings" w:hAnsi="Wingdings" w:hint="default"/>
+        <w:sz w:val="20"/>
+      </w:rPr>
+    </w:lvl>
+    <w:lvl w:ilvl="5" w:tentative="1">
+      <w:start w:val="1"/>
+      <w:numFmt w:val="bullet"/>
+      <w:lvlText w:val=""/>
+      <w:lvlJc w:val="left"/>
+      <w:pPr>
+        <w:tabs>
+          <w:tab w:val="num" w:pos="4320"/>
+        </w:tabs>
+        <w:ind w:left="4320" w:hanging="360"/>
+      </w:pPr>
+      <w:rPr>
+        <w:rFonts w:ascii="Wingdings" w:hAnsi="Wingdings" w:hint="default"/>
+        <w:sz w:val="20"/>
+      </w:rPr>
+    </w:lvl>
+    <w:lvl w:ilvl="6" w:tentative="1">
+      <w:start w:val="1"/>
+      <w:numFmt w:val="bullet"/>
+      <w:lvlText w:val=""/>
+      <w:lvlJc w:val="left"/>
+      <w:pPr>
+        <w:tabs>
+          <w:tab w:val="num" w:pos="5040"/>
+        </w:tabs>
+        <w:ind w:left="5040" w:hanging="360"/>
+      </w:pPr>
+      <w:rPr>
+        <w:rFonts w:ascii="Wingdings" w:hAnsi="Wingdings" w:hint="default"/>
+        <w:sz w:val="20"/>
+      </w:rPr>
+    </w:lvl>
+    <w:lvl w:ilvl="7" w:tentative="1">
+      <w:start w:val="1"/>
+      <w:numFmt w:val="bullet"/>
+      <w:lvlText w:val=""/>
+      <w:lvlJc w:val="left"/>
+      <w:pPr>
+        <w:tabs>
+          <w:tab w:val="num" w:pos="5760"/>
+        </w:tabs>
+        <w:ind w:left="5760" w:hanging="360"/>
+      </w:pPr>
+      <w:rPr>
+        <w:rFonts w:ascii="Wingdings" w:hAnsi="Wingdings" w:hint="default"/>
+        <w:sz w:val="20"/>
+      </w:rPr>
+    </w:lvl>
+    <w:lvl w:ilvl="8" w:tentative="1">
+      <w:start w:val="1"/>
+      <w:numFmt w:val="bullet"/>
+      <w:lvlText w:val=""/>
+      <w:lvlJc w:val="left"/>
+      <w:pPr>
+        <w:tabs>
+          <w:tab w:val="num" w:pos="6480"/>
+        </w:tabs>
+        <w:ind w:left="6480" w:hanging="360"/>
+      </w:pPr>
+      <w:rPr>
+        <w:rFonts w:ascii="Wingdings" w:hAnsi="Wingdings" w:hint="default"/>
+        <w:sz w:val="20"/>
+      </w:rPr>
+    </w:lvl>
+  </w:abstractNum>
+  <w:abstractNum w:abstractNumId="13">
+    <w:nsid w:val="680014C6"/>
+    <w:multiLevelType w:val="multilevel"/>
+    <w:tmpl w:val="5634634C"/>
+    <w:lvl w:ilvl="0">
+      <w:start w:val="1"/>
+      <w:numFmt w:val="bullet"/>
+      <w:lvlText w:val=""/>
+      <w:lvlJc w:val="left"/>
+      <w:pPr>
+        <w:tabs>
+          <w:tab w:val="num" w:pos="720"/>
+        </w:tabs>
+        <w:ind w:left="720" w:hanging="360"/>
+      </w:pPr>
+      <w:rPr>
+        <w:rFonts w:ascii="Symbol" w:hAnsi="Symbol" w:hint="default"/>
+        <w:sz w:val="20"/>
+      </w:rPr>
+    </w:lvl>
+    <w:lvl w:ilvl="1" w:tentative="1">
+      <w:start w:val="1"/>
+      <w:numFmt w:val="bullet"/>
+      <w:lvlText w:val="o"/>
+      <w:lvlJc w:val="left"/>
+      <w:pPr>
+        <w:tabs>
+          <w:tab w:val="num" w:pos="1440"/>
+        </w:tabs>
+        <w:ind w:left="1440" w:hanging="360"/>
+      </w:pPr>
+      <w:rPr>
+        <w:rFonts w:ascii="Courier New" w:hAnsi="Courier New" w:hint="default"/>
+        <w:sz w:val="20"/>
+      </w:rPr>
+    </w:lvl>
+    <w:lvl w:ilvl="2" w:tentative="1">
+      <w:start w:val="1"/>
+      <w:numFmt w:val="bullet"/>
+      <w:lvlText w:val=""/>
+      <w:lvlJc w:val="left"/>
+      <w:pPr>
+        <w:tabs>
+          <w:tab w:val="num" w:pos="2160"/>
+        </w:tabs>
+        <w:ind w:left="2160" w:hanging="360"/>
+      </w:pPr>
+      <w:rPr>
+        <w:rFonts w:ascii="Wingdings" w:hAnsi="Wingdings" w:hint="default"/>
+        <w:sz w:val="20"/>
+      </w:rPr>
+    </w:lvl>
+    <w:lvl w:ilvl="3" w:tentative="1">
+      <w:start w:val="1"/>
+      <w:numFmt w:val="bullet"/>
+      <w:lvlText w:val=""/>
+      <w:lvlJc w:val="left"/>
+      <w:pPr>
+        <w:tabs>
+          <w:tab w:val="num" w:pos="2880"/>
+        </w:tabs>
+        <w:ind w:left="2880" w:hanging="360"/>
+      </w:pPr>
+      <w:rPr>
+        <w:rFonts w:ascii="Wingdings" w:hAnsi="Wingdings" w:hint="default"/>
+        <w:sz w:val="20"/>
+      </w:rPr>
+    </w:lvl>
+    <w:lvl w:ilvl="4" w:tentative="1">
+      <w:start w:val="1"/>
+      <w:numFmt w:val="bullet"/>
+      <w:lvlText w:val=""/>
+      <w:lvlJc w:val="left"/>
+      <w:pPr>
+        <w:tabs>
+          <w:tab w:val="num" w:pos="3600"/>
+        </w:tabs>
+        <w:ind w:left="3600" w:hanging="360"/>
+      </w:pPr>
+      <w:rPr>
+        <w:rFonts w:ascii="Wingdings" w:hAnsi="Wingdings" w:hint="default"/>
+        <w:sz w:val="20"/>
+      </w:rPr>
+    </w:lvl>
+    <w:lvl w:ilvl="5" w:tentative="1">
+      <w:start w:val="1"/>
+      <w:numFmt w:val="bullet"/>
+      <w:lvlText w:val=""/>
+      <w:lvlJc w:val="left"/>
+      <w:pPr>
+        <w:tabs>
+          <w:tab w:val="num" w:pos="4320"/>
+        </w:tabs>
+        <w:ind w:left="4320" w:hanging="360"/>
+      </w:pPr>
+      <w:rPr>
+        <w:rFonts w:ascii="Wingdings" w:hAnsi="Wingdings" w:hint="default"/>
+        <w:sz w:val="20"/>
+      </w:rPr>
+    </w:lvl>
+    <w:lvl w:ilvl="6" w:tentative="1">
+      <w:start w:val="1"/>
+      <w:numFmt w:val="bullet"/>
+      <w:lvlText w:val=""/>
+      <w:lvlJc w:val="left"/>
+      <w:pPr>
+        <w:tabs>
+          <w:tab w:val="num" w:pos="5040"/>
+        </w:tabs>
+        <w:ind w:left="5040" w:hanging="360"/>
+      </w:pPr>
+      <w:rPr>
+        <w:rFonts w:ascii="Wingdings" w:hAnsi="Wingdings" w:hint="default"/>
+        <w:sz w:val="20"/>
+      </w:rPr>
+    </w:lvl>
+    <w:lvl w:ilvl="7" w:tentative="1">
+      <w:start w:val="1"/>
+      <w:numFmt w:val="bullet"/>
+      <w:lvlText w:val=""/>
+      <w:lvlJc w:val="left"/>
+      <w:pPr>
+        <w:tabs>
+          <w:tab w:val="num" w:pos="5760"/>
+        </w:tabs>
+        <w:ind w:left="5760" w:hanging="360"/>
+      </w:pPr>
+      <w:rPr>
+        <w:rFonts w:ascii="Wingdings" w:hAnsi="Wingdings" w:hint="default"/>
+        <w:sz w:val="20"/>
+      </w:rPr>
+    </w:lvl>
+    <w:lvl w:ilvl="8" w:tentative="1">
+      <w:start w:val="1"/>
+      <w:numFmt w:val="bullet"/>
+      <w:lvlText w:val=""/>
+      <w:lvlJc w:val="left"/>
+      <w:pPr>
+        <w:tabs>
+          <w:tab w:val="num" w:pos="6480"/>
+        </w:tabs>
+        <w:ind w:left="6480" w:hanging="360"/>
+      </w:pPr>
+      <w:rPr>
+        <w:rFonts w:ascii="Wingdings" w:hAnsi="Wingdings" w:hint="default"/>
+        <w:sz w:val="20"/>
+      </w:rPr>
+    </w:lvl>
+  </w:abstractNum>
+  <w:abstractNum w:abstractNumId="14">
+    <w:nsid w:val="724E6BA6"/>
+    <w:multiLevelType w:val="multilevel"/>
+    <w:tmpl w:val="3084A9AC"/>
+    <w:lvl w:ilvl="0">
+      <w:start w:val="1"/>
+      <w:numFmt w:val="bullet"/>
+      <w:lvlText w:val=""/>
+      <w:lvlJc w:val="left"/>
+      <w:pPr>
+        <w:tabs>
+          <w:tab w:val="num" w:pos="720"/>
+        </w:tabs>
+        <w:ind w:left="720" w:hanging="360"/>
+      </w:pPr>
+      <w:rPr>
+        <w:rFonts w:ascii="Symbol" w:hAnsi="Symbol" w:hint="default"/>
+        <w:sz w:val="20"/>
+      </w:rPr>
+    </w:lvl>
+    <w:lvl w:ilvl="1" w:tentative="1">
+      <w:start w:val="1"/>
+      <w:numFmt w:val="bullet"/>
+      <w:lvlText w:val="o"/>
+      <w:lvlJc w:val="left"/>
+      <w:pPr>
+        <w:tabs>
+          <w:tab w:val="num" w:pos="1440"/>
+        </w:tabs>
+        <w:ind w:left="1440" w:hanging="360"/>
+      </w:pPr>
+      <w:rPr>
+        <w:rFonts w:ascii="Courier New" w:hAnsi="Courier New" w:hint="default"/>
+        <w:sz w:val="20"/>
+      </w:rPr>
+    </w:lvl>
+    <w:lvl w:ilvl="2" w:tentative="1">
+      <w:start w:val="1"/>
+      <w:numFmt w:val="bullet"/>
+      <w:lvlText w:val=""/>
+      <w:lvlJc w:val="left"/>
+      <w:pPr>
+        <w:tabs>
+          <w:tab w:val="num" w:pos="2160"/>
+        </w:tabs>
+        <w:ind w:left="2160" w:hanging="360"/>
+      </w:pPr>
+      <w:rPr>
+        <w:rFonts w:ascii="Wingdings" w:hAnsi="Wingdings" w:hint="default"/>
+        <w:sz w:val="20"/>
+      </w:rPr>
+    </w:lvl>
+    <w:lvl w:ilvl="3" w:tentative="1">
+      <w:start w:val="1"/>
+      <w:numFmt w:val="bullet"/>
+      <w:lvlText w:val=""/>
+      <w:lvlJc w:val="left"/>
+      <w:pPr>
+        <w:tabs>
+          <w:tab w:val="num" w:pos="2880"/>
+        </w:tabs>
+        <w:ind w:left="2880" w:hanging="360"/>
+      </w:pPr>
+      <w:rPr>
+        <w:rFonts w:ascii="Wingdings" w:hAnsi="Wingdings" w:hint="default"/>
+        <w:sz w:val="20"/>
+      </w:rPr>
+    </w:lvl>
+    <w:lvl w:ilvl="4" w:tentative="1">
+      <w:start w:val="1"/>
+      <w:numFmt w:val="bullet"/>
+      <w:lvlText w:val=""/>
+      <w:lvlJc w:val="left"/>
+      <w:pPr>
+        <w:tabs>
+          <w:tab w:val="num" w:pos="3600"/>
+        </w:tabs>
+        <w:ind w:left="3600" w:hanging="360"/>
+      </w:pPr>
+      <w:rPr>
+        <w:rFonts w:ascii="Wingdings" w:hAnsi="Wingdings" w:hint="default"/>
+        <w:sz w:val="20"/>
+      </w:rPr>
+    </w:lvl>
+    <w:lvl w:ilvl="5" w:tentative="1">
+      <w:start w:val="1"/>
+      <w:numFmt w:val="bullet"/>
+      <w:lvlText w:val=""/>
+      <w:lvlJc w:val="left"/>
+      <w:pPr>
+        <w:tabs>
+          <w:tab w:val="num" w:pos="4320"/>
+        </w:tabs>
+        <w:ind w:left="4320" w:hanging="360"/>
+      </w:pPr>
+      <w:rPr>
+        <w:rFonts w:ascii="Wingdings" w:hAnsi="Wingdings" w:hint="default"/>
+        <w:sz w:val="20"/>
+      </w:rPr>
+    </w:lvl>
+    <w:lvl w:ilvl="6" w:tentative="1">
+      <w:start w:val="1"/>
+      <w:numFmt w:val="bullet"/>
+      <w:lvlText w:val=""/>
+      <w:lvlJc w:val="left"/>
+      <w:pPr>
+        <w:tabs>
+          <w:tab w:val="num" w:pos="5040"/>
+        </w:tabs>
+        <w:ind w:left="5040" w:hanging="360"/>
+      </w:pPr>
+      <w:rPr>
+        <w:rFonts w:ascii="Wingdings" w:hAnsi="Wingdings" w:hint="default"/>
+        <w:sz w:val="20"/>
+      </w:rPr>
+    </w:lvl>
+    <w:lvl w:ilvl="7" w:tentative="1">
+      <w:start w:val="1"/>
+      <w:numFmt w:val="bullet"/>
+      <w:lvlText w:val=""/>
+      <w:lvlJc w:val="left"/>
+      <w:pPr>
+        <w:tabs>
+          <w:tab w:val="num" w:pos="5760"/>
+        </w:tabs>
+        <w:ind w:left="5760" w:hanging="360"/>
+      </w:pPr>
+      <w:rPr>
+        <w:rFonts w:ascii="Wingdings" w:hAnsi="Wingdings" w:hint="default"/>
+        <w:sz w:val="20"/>
+      </w:rPr>
+    </w:lvl>
+    <w:lvl w:ilvl="8" w:tentative="1">
+      <w:start w:val="1"/>
+      <w:numFmt w:val="bullet"/>
+      <w:lvlText w:val=""/>
+      <w:lvlJc w:val="left"/>
+      <w:pPr>
+        <w:tabs>
+          <w:tab w:val="num" w:pos="6480"/>
+        </w:tabs>
+        <w:ind w:left="6480" w:hanging="360"/>
+      </w:pPr>
+      <w:rPr>
+        <w:rFonts w:ascii="Wingdings" w:hAnsi="Wingdings" w:hint="default"/>
+        <w:sz w:val="20"/>
+      </w:rPr>
+    </w:lvl>
+  </w:abstractNum>
   <w:num w:numId="1">
-    <w:abstractNumId w:val="4"/>
+    <w:abstractNumId w:val="9"/>
   </w:num>
   <w:num w:numId="2">
+    <w:abstractNumId w:val="14"/>
+  </w:num>
+  <w:num w:numId="3">
+    <w:abstractNumId w:val="10"/>
+  </w:num>
+  <w:num w:numId="4">
     <w:abstractNumId w:val="6"/>
   </w:num>
-  <w:num w:numId="3">
-    <w:abstractNumId w:val="5"/>
-  </w:num>
-  <w:num w:numId="4">
-    <w:abstractNumId w:val="2"/>
-  </w:num>
   <w:num w:numId="5">
-    <w:abstractNumId w:val="3"/>
+    <w:abstractNumId w:val="8"/>
   </w:num>
   <w:num w:numId="6">
     <w:abstractNumId w:val="0"/>
   </w:num>
   <w:num w:numId="7">
     <w:abstractNumId w:val="1"/>
+  </w:num>
+  <w:num w:numId="8">
+    <w:abstractNumId w:val="2"/>
+  </w:num>
+  <w:num w:numId="9">
+    <w:abstractNumId w:val="13"/>
+  </w:num>
+  <w:num w:numId="10">
+    <w:abstractNumId w:val="4"/>
+  </w:num>
+  <w:num w:numId="11">
+    <w:abstractNumId w:val="3"/>
+  </w:num>
+  <w:num w:numId="12">
+    <w:abstractNumId w:val="12"/>
+  </w:num>
+  <w:num w:numId="13">
+    <w:abstractNumId w:val="11"/>
+  </w:num>
+  <w:num w:numId="14">
+    <w:abstractNumId w:val="5"/>
+  </w:num>
+  <w:num w:numId="15">
+    <w:abstractNumId w:val="7"/>
   </w:num>
 </w:numbering>
 </file>

</xml_diff>